<commit_message>
Sincroniza com a produção — restringe quem pode editar/excluir um registro
Co-Authored-By: Claude Sonnet 5 <noreply@anthropic.com>
</commit_message>
<xml_diff>
--- a/Regras de Acesso e Permissoes - Sistema UNIALFA.docx
+++ b/Regras de Acesso e Permissoes - Sistema UNIALFA.docx
@@ -3177,16 +3177,160 @@
     </w:p>
     <w:p>
       <w:pPr>
-        <w:spacing w:before="120" w:after="200" w:line="280" w:lineRule="auto"/>
-        <w:rPr>
-          <w:color w:val="1A1A1A"/>
-          <w:sz w:val="22"/>
-        </w:rPr>
-      </w:pPr>
-    </w:p>
-    <w:p>
-      <w:pPr>
-        <w:spacing w:before="360" w:line="280" w:lineRule="auto"/>
+        <w:spacing w:before="240" w:after="120" w:line="280" w:lineRule="auto"/>
+        <w:rPr>
+          <w:b/>
+          <w:color w:val="B91D2E"/>
+          <w:sz w:val="26"/>
+        </w:rPr>
+      </w:pPr>
+      <w:r>
+        <w:rPr>
+          <w:b/>
+          <w:color w:val="B91D2E"/>
+          <w:sz w:val="26"/>
+        </w:rPr>
+        <w:t>5.4 Quem pode editar ou excluir um registro ja criado</w:t>
+      </w:r>
+    </w:p>
+    <w:p>
+      <w:pPr>
+        <w:spacing w:before="240" w:line="280" w:lineRule="auto"/>
+        <w:rPr>
+          <w:color w:val="1A1A1A"/>
+          <w:sz w:val="22"/>
+        </w:rPr>
+      </w:pPr>
+      <w:r>
+        <w:rPr>
+          <w:color w:val="1A1A1A"/>
+          <w:sz w:val="22"/>
+        </w:rPr>
+        <w:t>Alem da restricao por equipe (quem pode criar um registro vinculado a um projeto), o sistema tambem restringe quem pode editar ou excluir um registro depois de criado, nos 9 formularios que tem essa acao: Solicitacao de Demanda, Canvas de Projeto, TAP, Planejamento e Desenvolvimento, EAP, SMP, Ata de Reuniao, TEP e RLA.</w:t>
+      </w:r>
+    </w:p>
+    <w:p>
+      <w:pPr>
+        <w:pStyle w:val="PargrafodaLista"/>
+        <w:numPr>
+          <w:ilvl w:val="0"/>
+          <w:numId w:val="22"/>
+        </w:numPr>
+        <w:spacing w:before="240" w:after="80" w:line="260" w:lineRule="auto"/>
+        <w:ind w:left="700"/>
+        <w:rPr>
+          <w:color w:val="1A1A1A"/>
+          <w:sz w:val="22"/>
+        </w:rPr>
+      </w:pPr>
+      <w:r>
+        <w:rPr>
+          <w:color w:val="1A1A1A"/>
+          <w:sz w:val="22"/>
+        </w:rPr>
+        <w:t>Editar: apenas quem criou o registro, quem tem o papel Gerente de Projetos, ou o Admin.</w:t>
+      </w:r>
+    </w:p>
+    <w:p>
+      <w:pPr>
+        <w:pStyle w:val="PargrafodaLista"/>
+        <w:numPr>
+          <w:ilvl w:val="0"/>
+          <w:numId w:val="22"/>
+        </w:numPr>
+        <w:spacing w:before="240" w:after="80" w:line="260" w:lineRule="auto"/>
+        <w:ind w:left="700"/>
+        <w:rPr>
+          <w:color w:val="1A1A1A"/>
+          <w:sz w:val="22"/>
+        </w:rPr>
+      </w:pPr>
+      <w:r>
+        <w:rPr>
+          <w:color w:val="1A1A1A"/>
+          <w:sz w:val="22"/>
+        </w:rPr>
+        <w:t>Excluir: apenas quem tem o papel Gerente de Projetos, ou o Admin.</w:t>
+      </w:r>
+    </w:p>
+    <w:p>
+      <w:pPr>
+        <w:pStyle w:val="PargrafodaLista"/>
+        <w:numPr>
+          <w:ilvl w:val="0"/>
+          <w:numId w:val="22"/>
+        </w:numPr>
+        <w:spacing w:before="240" w:after="80" w:line="260" w:lineRule="auto"/>
+        <w:ind w:left="700"/>
+        <w:rPr>
+          <w:color w:val="1A1A1A"/>
+          <w:sz w:val="22"/>
+        </w:rPr>
+      </w:pPr>
+      <w:r>
+        <w:rPr>
+          <w:color w:val="1A1A1A"/>
+          <w:sz w:val="22"/>
+        </w:rPr>
+        <w:t>O papel Gerente de Projetos e um atributo global da conta (Administracao &gt; Usuarios), nao um vinculo especifico a um projeto - qualquer conta com esse papel pode editar/excluir registros de qualquer projeto, nao so dos que participa. Nao existe hoje um vinculo estruturado de "GP responsavel por este projeto" separado do papel da conta.</w:t>
+      </w:r>
+    </w:p>
+    <w:p>
+      <w:pPr>
+        <w:pStyle w:val="PargrafodaLista"/>
+        <w:numPr>
+          <w:ilvl w:val="0"/>
+          <w:numId w:val="22"/>
+        </w:numPr>
+        <w:spacing w:before="240" w:after="80" w:line="260" w:lineRule="auto"/>
+        <w:ind w:left="700"/>
+        <w:rPr>
+          <w:color w:val="1A1A1A"/>
+          <w:sz w:val="22"/>
+        </w:rPr>
+      </w:pPr>
+      <w:r>
+        <w:rPr>
+          <w:color w:val="1A1A1A"/>
+          <w:sz w:val="22"/>
+        </w:rPr>
+        <w:t>Os botoes "Editar dados" e "Excluir" ficam ocultos para quem nao tem permissao, em vez de aparecerem e barrarem a acao so no clique.</w:t>
+      </w:r>
+    </w:p>
+    <w:p>
+      <w:pPr>
+        <w:pStyle w:val="PargrafodaLista"/>
+        <w:numPr>
+          <w:ilvl w:val="0"/>
+          <w:numId w:val="22"/>
+        </w:numPr>
+        <w:spacing w:before="240" w:after="80" w:line="260" w:lineRule="auto"/>
+        <w:ind w:left="700"/>
+        <w:rPr>
+          <w:color w:val="1A1A1A"/>
+          <w:sz w:val="22"/>
+        </w:rPr>
+      </w:pPr>
+      <w:r>
+        <w:rPr>
+          <w:color w:val="1A1A1A"/>
+          <w:sz w:val="22"/>
+        </w:rPr>
+        <w:t>Nao se aplica ao Plano de Comunicacao de Projeto (secao 3.7 ja cobre a edicao desse formulario separadamente) nem ao Relatorio de Situacao/Relatorio de Entregas, que sao documentos unicos por projeto sem o conceito de "registro individual criado por alguem".</w:t>
+      </w:r>
+    </w:p>
+    <w:p>
+      <w:pPr>
+        <w:spacing w:before="120" w:after="200" w:line="260" w:lineRule="auto"/>
+        <w:rPr>
+          <w:color w:val="1A1A1A"/>
+          <w:sz w:val="22"/>
+        </w:rPr>
+      </w:pPr>
+    </w:p>
+    <w:p>
+      <w:pPr>
+        <w:spacing w:before="360" w:line="260" w:lineRule="auto"/>
         <w:rPr>
           <w:b/>
           <w:color w:val="1A1A1A"/>
@@ -3240,7 +3384,7 @@
           </w:tcPr>
           <w:p>
             <w:pPr>
-              <w:spacing w:before="360" w:line="280" w:lineRule="auto"/>
+              <w:spacing w:before="360" w:line="260" w:lineRule="auto"/>
               <w:rPr>
                 <w:b/>
                 <w:color w:val="FFFFFF"/>
@@ -3264,7 +3408,7 @@
           </w:tcPr>
           <w:p>
             <w:pPr>
-              <w:spacing w:before="360" w:line="280" w:lineRule="auto"/>
+              <w:spacing w:before="360" w:line="260" w:lineRule="auto"/>
               <w:rPr>
                 <w:b/>
                 <w:color w:val="FFFFFF"/>
@@ -3288,7 +3432,7 @@
           </w:tcPr>
           <w:p>
             <w:pPr>
-              <w:spacing w:before="360" w:line="280" w:lineRule="auto"/>
+              <w:spacing w:before="360" w:line="260" w:lineRule="auto"/>
               <w:rPr>
                 <w:b/>
                 <w:color w:val="FFFFFF"/>
@@ -3312,7 +3456,7 @@
           </w:tcPr>
           <w:p>
             <w:pPr>
-              <w:spacing w:before="360" w:line="280" w:lineRule="auto"/>
+              <w:spacing w:before="360" w:line="260" w:lineRule="auto"/>
               <w:rPr>
                 <w:b/>
                 <w:color w:val="FFFFFF"/>
@@ -3343,7 +3487,7 @@
           </w:tcPr>
           <w:p>
             <w:pPr>
-              <w:spacing w:before="360" w:line="280" w:lineRule="auto"/>
+              <w:spacing w:before="360" w:line="260" w:lineRule="auto"/>
               <w:rPr>
                 <w:color w:val="1A1A1A"/>
                 <w:sz w:val="19"/>
@@ -3364,7 +3508,7 @@
           </w:tcPr>
           <w:p>
             <w:pPr>
-              <w:spacing w:before="360" w:line="280" w:lineRule="auto"/>
+              <w:spacing w:before="360" w:line="260" w:lineRule="auto"/>
               <w:rPr>
                 <w:color w:val="1A1A1A"/>
                 <w:sz w:val="19"/>
@@ -3385,7 +3529,7 @@
           </w:tcPr>
           <w:p>
             <w:pPr>
-              <w:spacing w:before="360" w:line="280" w:lineRule="auto"/>
+              <w:spacing w:before="360" w:line="260" w:lineRule="auto"/>
               <w:rPr>
                 <w:color w:val="1A1A1A"/>
                 <w:sz w:val="19"/>
@@ -3406,7 +3550,7 @@
           </w:tcPr>
           <w:p>
             <w:pPr>
-              <w:spacing w:before="360" w:line="280" w:lineRule="auto"/>
+              <w:spacing w:before="360" w:line="260" w:lineRule="auto"/>
               <w:rPr>
                 <w:color w:val="1A1A1A"/>
                 <w:sz w:val="19"/>
@@ -3435,7 +3579,7 @@
           </w:tcPr>
           <w:p>
             <w:pPr>
-              <w:spacing w:before="360" w:line="280" w:lineRule="auto"/>
+              <w:spacing w:before="360" w:line="260" w:lineRule="auto"/>
               <w:rPr>
                 <w:color w:val="1A1A1A"/>
                 <w:sz w:val="19"/>
@@ -3456,7 +3600,7 @@
           </w:tcPr>
           <w:p>
             <w:pPr>
-              <w:spacing w:before="360" w:line="280" w:lineRule="auto"/>
+              <w:spacing w:before="360" w:line="260" w:lineRule="auto"/>
               <w:rPr>
                 <w:color w:val="1A1A1A"/>
                 <w:sz w:val="19"/>
@@ -3477,7 +3621,7 @@
           </w:tcPr>
           <w:p>
             <w:pPr>
-              <w:spacing w:before="360" w:line="280" w:lineRule="auto"/>
+              <w:spacing w:before="360" w:line="260" w:lineRule="auto"/>
               <w:rPr>
                 <w:color w:val="1A1A1A"/>
                 <w:sz w:val="19"/>
@@ -3498,7 +3642,7 @@
           </w:tcPr>
           <w:p>
             <w:pPr>
-              <w:spacing w:before="360" w:line="280" w:lineRule="auto"/>
+              <w:spacing w:before="360" w:line="260" w:lineRule="auto"/>
               <w:rPr>
                 <w:color w:val="1A1A1A"/>
                 <w:sz w:val="19"/>
@@ -3527,7 +3671,7 @@
           </w:tcPr>
           <w:p>
             <w:pPr>
-              <w:spacing w:before="360" w:line="280" w:lineRule="auto"/>
+              <w:spacing w:before="360" w:line="260" w:lineRule="auto"/>
               <w:rPr>
                 <w:color w:val="1A1A1A"/>
                 <w:sz w:val="19"/>
@@ -3548,7 +3692,7 @@
           </w:tcPr>
           <w:p>
             <w:pPr>
-              <w:spacing w:before="360" w:line="280" w:lineRule="auto"/>
+              <w:spacing w:before="360" w:line="260" w:lineRule="auto"/>
               <w:rPr>
                 <w:color w:val="1A1A1A"/>
                 <w:sz w:val="19"/>
@@ -3569,7 +3713,7 @@
           </w:tcPr>
           <w:p>
             <w:pPr>
-              <w:spacing w:before="360" w:line="280" w:lineRule="auto"/>
+              <w:spacing w:before="360" w:line="260" w:lineRule="auto"/>
               <w:rPr>
                 <w:color w:val="1A1A1A"/>
                 <w:sz w:val="19"/>
@@ -3590,7 +3734,7 @@
           </w:tcPr>
           <w:p>
             <w:pPr>
-              <w:spacing w:before="360" w:line="280" w:lineRule="auto"/>
+              <w:spacing w:before="360" w:line="260" w:lineRule="auto"/>
               <w:rPr>
                 <w:color w:val="1A1A1A"/>
                 <w:sz w:val="19"/>
@@ -3619,7 +3763,7 @@
           </w:tcPr>
           <w:p>
             <w:pPr>
-              <w:spacing w:before="360" w:line="280" w:lineRule="auto"/>
+              <w:spacing w:before="360" w:line="260" w:lineRule="auto"/>
               <w:rPr>
                 <w:color w:val="1A1A1A"/>
                 <w:sz w:val="19"/>
@@ -3640,7 +3784,7 @@
           </w:tcPr>
           <w:p>
             <w:pPr>
-              <w:spacing w:before="360" w:line="280" w:lineRule="auto"/>
+              <w:spacing w:before="360" w:line="260" w:lineRule="auto"/>
               <w:rPr>
                 <w:color w:val="1A1A1A"/>
                 <w:sz w:val="19"/>
@@ -3661,7 +3805,7 @@
           </w:tcPr>
           <w:p>
             <w:pPr>
-              <w:spacing w:before="360" w:line="280" w:lineRule="auto"/>
+              <w:spacing w:before="360" w:line="260" w:lineRule="auto"/>
               <w:rPr>
                 <w:color w:val="1A1A1A"/>
                 <w:sz w:val="19"/>
@@ -3682,7 +3826,7 @@
           </w:tcPr>
           <w:p>
             <w:pPr>
-              <w:spacing w:before="360" w:line="280" w:lineRule="auto"/>
+              <w:spacing w:before="360" w:line="260" w:lineRule="auto"/>
               <w:rPr>
                 <w:color w:val="1A1A1A"/>
                 <w:sz w:val="19"/>
@@ -3711,18 +3855,17 @@
           </w:tcPr>
           <w:p>
             <w:pPr>
-              <w:spacing w:before="360" w:line="280" w:lineRule="auto"/>
-              <w:rPr>
-                <w:color w:val="1A1A1A"/>
-                <w:sz w:val="19"/>
-              </w:rPr>
-            </w:pPr>
-            <w:r>
-              <w:rPr>
-                <w:color w:val="1A1A1A"/>
-                <w:sz w:val="19"/>
-              </w:rPr>
-              <w:lastRenderedPageBreak/>
+              <w:spacing w:before="360" w:line="260" w:lineRule="auto"/>
+              <w:rPr>
+                <w:color w:val="1A1A1A"/>
+                <w:sz w:val="19"/>
+              </w:rPr>
+            </w:pPr>
+            <w:r>
+              <w:rPr>
+                <w:color w:val="1A1A1A"/>
+                <w:sz w:val="19"/>
+              </w:rPr>
               <w:t>EAP</w:t>
             </w:r>
           </w:p>
@@ -3733,7 +3876,7 @@
           </w:tcPr>
           <w:p>
             <w:pPr>
-              <w:spacing w:before="360" w:line="280" w:lineRule="auto"/>
+              <w:spacing w:before="360" w:line="260" w:lineRule="auto"/>
               <w:rPr>
                 <w:color w:val="1A1A1A"/>
                 <w:sz w:val="19"/>
@@ -3754,7 +3897,7 @@
           </w:tcPr>
           <w:p>
             <w:pPr>
-              <w:spacing w:before="360" w:line="280" w:lineRule="auto"/>
+              <w:spacing w:before="360" w:line="260" w:lineRule="auto"/>
               <w:rPr>
                 <w:color w:val="1A1A1A"/>
                 <w:sz w:val="19"/>
@@ -3775,7 +3918,7 @@
           </w:tcPr>
           <w:p>
             <w:pPr>
-              <w:spacing w:before="360" w:line="280" w:lineRule="auto"/>
+              <w:spacing w:before="360" w:line="260" w:lineRule="auto"/>
               <w:rPr>
                 <w:color w:val="1A1A1A"/>
                 <w:sz w:val="19"/>
@@ -3804,7 +3947,7 @@
           </w:tcPr>
           <w:p>
             <w:pPr>
-              <w:spacing w:before="360" w:line="280" w:lineRule="auto"/>
+              <w:spacing w:before="360" w:line="260" w:lineRule="auto"/>
               <w:rPr>
                 <w:color w:val="1A1A1A"/>
                 <w:sz w:val="19"/>
@@ -3825,7 +3968,7 @@
           </w:tcPr>
           <w:p>
             <w:pPr>
-              <w:spacing w:before="360" w:line="280" w:lineRule="auto"/>
+              <w:spacing w:before="360" w:line="260" w:lineRule="auto"/>
               <w:rPr>
                 <w:color w:val="1A1A1A"/>
                 <w:sz w:val="19"/>
@@ -3846,7 +3989,7 @@
           </w:tcPr>
           <w:p>
             <w:pPr>
-              <w:spacing w:before="360" w:line="280" w:lineRule="auto"/>
+              <w:spacing w:before="360" w:line="260" w:lineRule="auto"/>
               <w:rPr>
                 <w:color w:val="1A1A1A"/>
                 <w:sz w:val="19"/>
@@ -3867,7 +4010,7 @@
           </w:tcPr>
           <w:p>
             <w:pPr>
-              <w:spacing w:before="360" w:line="280" w:lineRule="auto"/>
+              <w:spacing w:before="360" w:line="260" w:lineRule="auto"/>
               <w:rPr>
                 <w:color w:val="1A1A1A"/>
                 <w:sz w:val="19"/>
@@ -3896,7 +4039,7 @@
           </w:tcPr>
           <w:p>
             <w:pPr>
-              <w:spacing w:before="360" w:line="280" w:lineRule="auto"/>
+              <w:spacing w:before="360" w:line="260" w:lineRule="auto"/>
               <w:rPr>
                 <w:color w:val="1A1A1A"/>
                 <w:sz w:val="19"/>
@@ -3917,7 +4060,7 @@
           </w:tcPr>
           <w:p>
             <w:pPr>
-              <w:spacing w:before="360" w:line="280" w:lineRule="auto"/>
+              <w:spacing w:before="360" w:line="260" w:lineRule="auto"/>
               <w:rPr>
                 <w:color w:val="1A1A1A"/>
                 <w:sz w:val="19"/>
@@ -3938,7 +4081,7 @@
           </w:tcPr>
           <w:p>
             <w:pPr>
-              <w:spacing w:before="360" w:line="280" w:lineRule="auto"/>
+              <w:spacing w:before="360" w:line="260" w:lineRule="auto"/>
               <w:rPr>
                 <w:color w:val="1A1A1A"/>
                 <w:sz w:val="19"/>
@@ -3959,7 +4102,7 @@
           </w:tcPr>
           <w:p>
             <w:pPr>
-              <w:spacing w:before="360" w:line="280" w:lineRule="auto"/>
+              <w:spacing w:before="360" w:line="260" w:lineRule="auto"/>
               <w:rPr>
                 <w:color w:val="1A1A1A"/>
                 <w:sz w:val="19"/>
@@ -3988,7 +4131,7 @@
           </w:tcPr>
           <w:p>
             <w:pPr>
-              <w:spacing w:before="360" w:line="280" w:lineRule="auto"/>
+              <w:spacing w:before="360" w:line="260" w:lineRule="auto"/>
               <w:rPr>
                 <w:color w:val="1A1A1A"/>
                 <w:sz w:val="19"/>
@@ -4009,7 +4152,7 @@
           </w:tcPr>
           <w:p>
             <w:pPr>
-              <w:spacing w:before="360" w:line="280" w:lineRule="auto"/>
+              <w:spacing w:before="360" w:line="260" w:lineRule="auto"/>
               <w:rPr>
                 <w:color w:val="1A1A1A"/>
                 <w:sz w:val="19"/>
@@ -4030,7 +4173,7 @@
           </w:tcPr>
           <w:p>
             <w:pPr>
-              <w:spacing w:before="360" w:line="280" w:lineRule="auto"/>
+              <w:spacing w:before="360" w:line="260" w:lineRule="auto"/>
               <w:rPr>
                 <w:color w:val="1A1A1A"/>
                 <w:sz w:val="19"/>
@@ -4051,7 +4194,7 @@
           </w:tcPr>
           <w:p>
             <w:pPr>
-              <w:spacing w:before="360" w:line="280" w:lineRule="auto"/>
+              <w:spacing w:before="360" w:line="260" w:lineRule="auto"/>
               <w:rPr>
                 <w:color w:val="1A1A1A"/>
                 <w:sz w:val="19"/>
@@ -4080,7 +4223,7 @@
           </w:tcPr>
           <w:p>
             <w:pPr>
-              <w:spacing w:before="360" w:line="280" w:lineRule="auto"/>
+              <w:spacing w:before="360" w:line="260" w:lineRule="auto"/>
               <w:rPr>
                 <w:color w:val="1A1A1A"/>
                 <w:sz w:val="19"/>
@@ -4101,7 +4244,7 @@
           </w:tcPr>
           <w:p>
             <w:pPr>
-              <w:spacing w:before="360" w:line="280" w:lineRule="auto"/>
+              <w:spacing w:before="360" w:line="260" w:lineRule="auto"/>
               <w:rPr>
                 <w:color w:val="1A1A1A"/>
                 <w:sz w:val="19"/>
@@ -4122,7 +4265,7 @@
           </w:tcPr>
           <w:p>
             <w:pPr>
-              <w:spacing w:before="360" w:line="280" w:lineRule="auto"/>
+              <w:spacing w:before="360" w:line="260" w:lineRule="auto"/>
               <w:rPr>
                 <w:color w:val="1A1A1A"/>
                 <w:sz w:val="19"/>
@@ -4143,7 +4286,7 @@
           </w:tcPr>
           <w:p>
             <w:pPr>
-              <w:spacing w:before="360" w:line="280" w:lineRule="auto"/>
+              <w:spacing w:before="360" w:line="260" w:lineRule="auto"/>
               <w:rPr>
                 <w:color w:val="1A1A1A"/>
                 <w:sz w:val="19"/>
@@ -4172,7 +4315,7 @@
           </w:tcPr>
           <w:p>
             <w:pPr>
-              <w:spacing w:before="360" w:line="280" w:lineRule="auto"/>
+              <w:spacing w:before="360" w:line="260" w:lineRule="auto"/>
               <w:rPr>
                 <w:color w:val="1A1A1A"/>
                 <w:sz w:val="19"/>
@@ -4193,7 +4336,7 @@
           </w:tcPr>
           <w:p>
             <w:pPr>
-              <w:spacing w:before="360" w:line="280" w:lineRule="auto"/>
+              <w:spacing w:before="360" w:line="260" w:lineRule="auto"/>
               <w:rPr>
                 <w:color w:val="1A1A1A"/>
                 <w:sz w:val="19"/>
@@ -4214,7 +4357,7 @@
           </w:tcPr>
           <w:p>
             <w:pPr>
-              <w:spacing w:before="360" w:line="280" w:lineRule="auto"/>
+              <w:spacing w:before="360" w:line="260" w:lineRule="auto"/>
               <w:rPr>
                 <w:color w:val="1A1A1A"/>
                 <w:sz w:val="19"/>
@@ -4235,7 +4378,7 @@
           </w:tcPr>
           <w:p>
             <w:pPr>
-              <w:spacing w:before="360" w:line="280" w:lineRule="auto"/>
+              <w:spacing w:before="360" w:line="260" w:lineRule="auto"/>
               <w:rPr>
                 <w:color w:val="1A1A1A"/>
                 <w:sz w:val="19"/>
@@ -4264,7 +4407,7 @@
           </w:tcPr>
           <w:p>
             <w:pPr>
-              <w:spacing w:before="360" w:line="280" w:lineRule="auto"/>
+              <w:spacing w:before="360" w:line="260" w:lineRule="auto"/>
               <w:rPr>
                 <w:color w:val="1A1A1A"/>
                 <w:sz w:val="19"/>
@@ -4285,7 +4428,7 @@
           </w:tcPr>
           <w:p>
             <w:pPr>
-              <w:spacing w:before="360" w:line="280" w:lineRule="auto"/>
+              <w:spacing w:before="360" w:line="260" w:lineRule="auto"/>
               <w:rPr>
                 <w:color w:val="1A1A1A"/>
                 <w:sz w:val="19"/>
@@ -4306,7 +4449,7 @@
           </w:tcPr>
           <w:p>
             <w:pPr>
-              <w:spacing w:before="360" w:line="280" w:lineRule="auto"/>
+              <w:spacing w:before="360" w:line="260" w:lineRule="auto"/>
               <w:rPr>
                 <w:color w:val="1A1A1A"/>
                 <w:sz w:val="19"/>
@@ -4327,7 +4470,7 @@
           </w:tcPr>
           <w:p>
             <w:pPr>
-              <w:spacing w:before="360" w:line="280" w:lineRule="auto"/>
+              <w:spacing w:before="360" w:line="260" w:lineRule="auto"/>
               <w:rPr>
                 <w:color w:val="1A1A1A"/>
                 <w:sz w:val="19"/>
@@ -4356,7 +4499,7 @@
           </w:tcPr>
           <w:p>
             <w:pPr>
-              <w:spacing w:before="360" w:line="280" w:lineRule="auto"/>
+              <w:spacing w:before="360" w:line="260" w:lineRule="auto"/>
               <w:rPr>
                 <w:color w:val="1A1A1A"/>
                 <w:sz w:val="19"/>
@@ -4377,7 +4520,7 @@
           </w:tcPr>
           <w:p>
             <w:pPr>
-              <w:spacing w:before="360" w:line="280" w:lineRule="auto"/>
+              <w:spacing w:before="360" w:line="260" w:lineRule="auto"/>
               <w:rPr>
                 <w:color w:val="1A1A1A"/>
                 <w:sz w:val="19"/>
@@ -4398,7 +4541,7 @@
           </w:tcPr>
           <w:p>
             <w:pPr>
-              <w:spacing w:before="360" w:line="280" w:lineRule="auto"/>
+              <w:spacing w:before="360" w:line="260" w:lineRule="auto"/>
               <w:rPr>
                 <w:color w:val="1A1A1A"/>
                 <w:sz w:val="19"/>
@@ -4419,7 +4562,7 @@
           </w:tcPr>
           <w:p>
             <w:pPr>
-              <w:spacing w:before="360" w:line="280" w:lineRule="auto"/>
+              <w:spacing w:before="360" w:line="260" w:lineRule="auto"/>
               <w:rPr>
                 <w:color w:val="1A1A1A"/>
                 <w:sz w:val="19"/>
@@ -4448,7 +4591,7 @@
           </w:tcPr>
           <w:p>
             <w:pPr>
-              <w:spacing w:before="360" w:line="280" w:lineRule="auto"/>
+              <w:spacing w:before="360" w:line="260" w:lineRule="auto"/>
               <w:rPr>
                 <w:color w:val="1A1A1A"/>
                 <w:sz w:val="19"/>
@@ -4469,7 +4612,7 @@
           </w:tcPr>
           <w:p>
             <w:pPr>
-              <w:spacing w:before="360" w:line="280" w:lineRule="auto"/>
+              <w:spacing w:before="360" w:line="260" w:lineRule="auto"/>
               <w:rPr>
                 <w:color w:val="1A1A1A"/>
                 <w:sz w:val="19"/>
@@ -4490,7 +4633,7 @@
           </w:tcPr>
           <w:p>
             <w:pPr>
-              <w:spacing w:before="360" w:line="280" w:lineRule="auto"/>
+              <w:spacing w:before="360" w:line="260" w:lineRule="auto"/>
               <w:rPr>
                 <w:color w:val="1A1A1A"/>
                 <w:sz w:val="19"/>
@@ -4511,7 +4654,7 @@
           </w:tcPr>
           <w:p>
             <w:pPr>
-              <w:spacing w:before="360" w:line="280" w:lineRule="auto"/>
+              <w:spacing w:before="360" w:line="260" w:lineRule="auto"/>
               <w:rPr>
                 <w:color w:val="1A1A1A"/>
                 <w:sz w:val="19"/>
@@ -4540,17 +4683,18 @@
           </w:tcPr>
           <w:p>
             <w:pPr>
-              <w:spacing w:before="360" w:line="280" w:lineRule="auto"/>
-              <w:rPr>
-                <w:color w:val="1A1A1A"/>
-                <w:sz w:val="19"/>
-              </w:rPr>
-            </w:pPr>
-            <w:r>
-              <w:rPr>
-                <w:color w:val="1A1A1A"/>
-                <w:sz w:val="19"/>
-              </w:rPr>
+              <w:spacing w:before="360" w:line="260" w:lineRule="auto"/>
+              <w:rPr>
+                <w:color w:val="1A1A1A"/>
+                <w:sz w:val="19"/>
+              </w:rPr>
+            </w:pPr>
+            <w:r>
+              <w:rPr>
+                <w:color w:val="1A1A1A"/>
+                <w:sz w:val="19"/>
+              </w:rPr>
+              <w:lastRenderedPageBreak/>
               <w:t>Painel Executivo</w:t>
             </w:r>
           </w:p>
@@ -4561,7 +4705,7 @@
           </w:tcPr>
           <w:p>
             <w:pPr>
-              <w:spacing w:before="360" w:line="280" w:lineRule="auto"/>
+              <w:spacing w:before="360" w:line="260" w:lineRule="auto"/>
               <w:rPr>
                 <w:color w:val="1A1A1A"/>
                 <w:sz w:val="19"/>
@@ -4582,7 +4726,7 @@
           </w:tcPr>
           <w:p>
             <w:pPr>
-              <w:spacing w:before="360" w:line="280" w:lineRule="auto"/>
+              <w:spacing w:before="360" w:line="260" w:lineRule="auto"/>
               <w:rPr>
                 <w:color w:val="1A1A1A"/>
                 <w:sz w:val="19"/>
@@ -4603,7 +4747,7 @@
           </w:tcPr>
           <w:p>
             <w:pPr>
-              <w:spacing w:before="360" w:line="280" w:lineRule="auto"/>
+              <w:spacing w:before="360" w:line="260" w:lineRule="auto"/>
               <w:rPr>
                 <w:color w:val="1A1A1A"/>
                 <w:sz w:val="19"/>
@@ -4632,7 +4776,7 @@
           </w:tcPr>
           <w:p>
             <w:pPr>
-              <w:spacing w:before="360" w:line="280" w:lineRule="auto"/>
+              <w:spacing w:before="360" w:line="260" w:lineRule="auto"/>
               <w:rPr>
                 <w:color w:val="1A1A1A"/>
                 <w:sz w:val="19"/>
@@ -4653,7 +4797,7 @@
           </w:tcPr>
           <w:p>
             <w:pPr>
-              <w:spacing w:before="360" w:line="280" w:lineRule="auto"/>
+              <w:spacing w:before="360" w:line="260" w:lineRule="auto"/>
               <w:rPr>
                 <w:color w:val="1A1A1A"/>
                 <w:sz w:val="19"/>
@@ -4674,7 +4818,7 @@
           </w:tcPr>
           <w:p>
             <w:pPr>
-              <w:spacing w:before="360" w:line="280" w:lineRule="auto"/>
+              <w:spacing w:before="360" w:line="260" w:lineRule="auto"/>
               <w:rPr>
                 <w:color w:val="1A1A1A"/>
                 <w:sz w:val="19"/>
@@ -4695,7 +4839,7 @@
           </w:tcPr>
           <w:p>
             <w:pPr>
-              <w:spacing w:before="360" w:line="280" w:lineRule="auto"/>
+              <w:spacing w:before="360" w:line="260" w:lineRule="auto"/>
               <w:rPr>
                 <w:color w:val="1A1A1A"/>
                 <w:sz w:val="19"/>
@@ -4724,7 +4868,7 @@
           </w:tcPr>
           <w:p>
             <w:pPr>
-              <w:spacing w:before="360" w:line="280" w:lineRule="auto"/>
+              <w:spacing w:before="360" w:line="260" w:lineRule="auto"/>
               <w:rPr>
                 <w:color w:val="1A1A1A"/>
                 <w:sz w:val="19"/>
@@ -4745,7 +4889,7 @@
           </w:tcPr>
           <w:p>
             <w:pPr>
-              <w:spacing w:before="360" w:line="280" w:lineRule="auto"/>
+              <w:spacing w:before="360" w:line="260" w:lineRule="auto"/>
               <w:rPr>
                 <w:color w:val="1A1A1A"/>
                 <w:sz w:val="19"/>
@@ -4766,7 +4910,7 @@
           </w:tcPr>
           <w:p>
             <w:pPr>
-              <w:spacing w:before="360" w:line="280" w:lineRule="auto"/>
+              <w:spacing w:before="360" w:line="260" w:lineRule="auto"/>
               <w:rPr>
                 <w:color w:val="1A1A1A"/>
                 <w:sz w:val="19"/>
@@ -4787,7 +4931,7 @@
           </w:tcPr>
           <w:p>
             <w:pPr>
-              <w:spacing w:before="360" w:line="280" w:lineRule="auto"/>
+              <w:spacing w:before="360" w:line="260" w:lineRule="auto"/>
               <w:rPr>
                 <w:color w:val="1A1A1A"/>
                 <w:sz w:val="19"/>
@@ -4806,7 +4950,7 @@
     </w:tbl>
     <w:p>
       <w:pPr>
-        <w:spacing w:before="360" w:line="280" w:lineRule="auto"/>
+        <w:spacing w:before="360" w:line="260" w:lineRule="auto"/>
         <w:rPr>
           <w:color w:val="1A1A1A"/>
           <w:sz w:val="32"/>
@@ -4853,7 +4997,7 @@
 <file path=word/numbering.xml><?xml version="1.0" encoding="utf-8"?>
 <w:numbering xmlns:wpc="http://schemas.microsoft.com/office/word/2010/wordprocessingCanvas" xmlns:cx="http://schemas.microsoft.com/office/drawing/2014/chartex" xmlns:cx1="http://schemas.microsoft.com/office/drawing/2015/9/8/chartex" xmlns:cx2="http://schemas.microsoft.com/office/drawing/2015/10/21/chartex" xmlns:cx3="http://schemas.microsoft.com/office/drawing/2016/5/9/chartex" xmlns:cx4="http://schemas.microsoft.com/office/drawing/2016/5/10/chartex" xmlns:cx5="http://schemas.microsoft.com/office/drawing/2016/5/11/chartex" xmlns:cx6="http://schemas.microsoft.com/office/drawing/2016/5/12/chartex" xmlns:cx7="http://schemas.microsoft.com/office/drawing/2016/5/13/chartex" xmlns:cx8="http://schemas.microsoft.com/office/drawing/2016/5/14/chartex" xmlns:mc="http://schemas.openxmlformats.org/markup-compatibility/2006" xmlns:aink="http://schemas.microsoft.com/office/drawing/2016/ink" xmlns:am3d="http://schemas.microsoft.com/office/drawing/2017/model3d" xmlns:o="urn:schemas-microsoft-com:office:office" xmlns:oel="http://schemas.microsoft.com/office/2019/extlst" xmlns:r="http://schemas.openxmlformats.org/officeDocument/2006/relationships" xmlns:m="http://schemas.openxmlformats.org/officeDocument/2006/math" xmlns:v="urn:schemas-microsoft-com:vml" xmlns:wp14="http://schemas.microsoft.com/office/word/2010/wordprocessingDrawing" xmlns:wp="http://schemas.openxmlformats.org/drawingml/2006/wordprocessingDrawing" xmlns:w10="urn:schemas-microsoft-com:office:word" xmlns:w="http://schemas.openxmlformats.org/wordprocessingml/2006/main" xmlns:w14="http://schemas.microsoft.com/office/word/2010/wordml" xmlns:w15="http://schemas.microsoft.com/office/word/2012/wordml" xmlns:w16cex="http://schemas.microsoft.com/office/word/2018/wordml/cex" xmlns:w16cid="http://schemas.microsoft.com/office/word/2016/wordml/cid" xmlns:w16="http://schemas.microsoft.com/office/word/2018/wordml" xmlns:w16du="http://schemas.microsoft.com/office/word/2023/wordml/word16du" xmlns:w16sdtdh="http://schemas.microsoft.com/office/word/2020/wordml/sdtdatahash" xmlns:w16sdtfl="http://schemas.microsoft.com/office/word/2024/wordml/sdtformatlock" xmlns:w16se="http://schemas.microsoft.com/office/word/2015/wordml/symex" xmlns:wpg="http://schemas.microsoft.com/office/word/2010/wordprocessingGroup" xmlns:wpi="http://schemas.microsoft.com/office/word/2010/wordprocessingInk" xmlns:wne="http://schemas.microsoft.com/office/word/2006/wordml" xmlns:wps="http://schemas.microsoft.com/office/word/2010/wordprocessingShape" mc:Ignorable="w14 w15 w16se w16cid w16 w16cex w16sdtdh w16sdtfl w16du wp14">
   <w:abstractNum w:abstractNumId="0" w15:restartNumberingAfterBreak="0">
-    <w:nsid w:val="05FA6811"/>
+    <w:nsid w:val="029F31BA"/>
     <w:multiLevelType w:val="singleLevel"/>
     <w:tmpl w:val="04160001"/>
     <w:lvl w:ilvl="0">
@@ -4870,7 +5014,7 @@
     </w:lvl>
   </w:abstractNum>
   <w:abstractNum w:abstractNumId="1" w15:restartNumberingAfterBreak="0">
-    <w:nsid w:val="0AAE604A"/>
+    <w:nsid w:val="03FD3EE1"/>
     <w:multiLevelType w:val="singleLevel"/>
     <w:tmpl w:val="04160001"/>
     <w:lvl w:ilvl="0">
@@ -4887,7 +5031,7 @@
     </w:lvl>
   </w:abstractNum>
   <w:abstractNum w:abstractNumId="2" w15:restartNumberingAfterBreak="0">
-    <w:nsid w:val="11593911"/>
+    <w:nsid w:val="0B1D194F"/>
     <w:multiLevelType w:val="singleLevel"/>
     <w:tmpl w:val="04160001"/>
     <w:lvl w:ilvl="0">
@@ -4904,7 +5048,7 @@
     </w:lvl>
   </w:abstractNum>
   <w:abstractNum w:abstractNumId="3" w15:restartNumberingAfterBreak="0">
-    <w:nsid w:val="1B9B383B"/>
+    <w:nsid w:val="13845D7B"/>
     <w:multiLevelType w:val="singleLevel"/>
     <w:tmpl w:val="04160001"/>
     <w:lvl w:ilvl="0">
@@ -4921,7 +5065,7 @@
     </w:lvl>
   </w:abstractNum>
   <w:abstractNum w:abstractNumId="4" w15:restartNumberingAfterBreak="0">
-    <w:nsid w:val="26873222"/>
+    <w:nsid w:val="15C85F99"/>
     <w:multiLevelType w:val="singleLevel"/>
     <w:tmpl w:val="04160001"/>
     <w:lvl w:ilvl="0">
@@ -4938,7 +5082,7 @@
     </w:lvl>
   </w:abstractNum>
   <w:abstractNum w:abstractNumId="5" w15:restartNumberingAfterBreak="0">
-    <w:nsid w:val="29751EED"/>
+    <w:nsid w:val="22832A0F"/>
     <w:multiLevelType w:val="singleLevel"/>
     <w:tmpl w:val="04160001"/>
     <w:lvl w:ilvl="0">
@@ -4955,7 +5099,7 @@
     </w:lvl>
   </w:abstractNum>
   <w:abstractNum w:abstractNumId="6" w15:restartNumberingAfterBreak="0">
-    <w:nsid w:val="2CDF2A4B"/>
+    <w:nsid w:val="251D03BE"/>
     <w:multiLevelType w:val="singleLevel"/>
     <w:tmpl w:val="04160001"/>
     <w:lvl w:ilvl="0">
@@ -4972,7 +5116,7 @@
     </w:lvl>
   </w:abstractNum>
   <w:abstractNum w:abstractNumId="7" w15:restartNumberingAfterBreak="0">
-    <w:nsid w:val="2EAC4357"/>
+    <w:nsid w:val="29974A5A"/>
     <w:multiLevelType w:val="singleLevel"/>
     <w:tmpl w:val="04160001"/>
     <w:lvl w:ilvl="0">
@@ -4989,7 +5133,7 @@
     </w:lvl>
   </w:abstractNum>
   <w:abstractNum w:abstractNumId="8" w15:restartNumberingAfterBreak="0">
-    <w:nsid w:val="34584554"/>
+    <w:nsid w:val="30490ADE"/>
     <w:multiLevelType w:val="singleLevel"/>
     <w:tmpl w:val="04160001"/>
     <w:lvl w:ilvl="0">
@@ -5006,7 +5150,7 @@
     </w:lvl>
   </w:abstractNum>
   <w:abstractNum w:abstractNumId="9" w15:restartNumberingAfterBreak="0">
-    <w:nsid w:val="370E5D04"/>
+    <w:nsid w:val="43210A10"/>
     <w:multiLevelType w:val="singleLevel"/>
     <w:tmpl w:val="04160001"/>
     <w:lvl w:ilvl="0">
@@ -5023,7 +5167,7 @@
     </w:lvl>
   </w:abstractNum>
   <w:abstractNum w:abstractNumId="10" w15:restartNumberingAfterBreak="0">
-    <w:nsid w:val="3D2870A1"/>
+    <w:nsid w:val="490179F1"/>
     <w:multiLevelType w:val="singleLevel"/>
     <w:tmpl w:val="04160001"/>
     <w:lvl w:ilvl="0">
@@ -5040,7 +5184,7 @@
     </w:lvl>
   </w:abstractNum>
   <w:abstractNum w:abstractNumId="11" w15:restartNumberingAfterBreak="0">
-    <w:nsid w:val="4151018C"/>
+    <w:nsid w:val="4ACC3E0E"/>
     <w:multiLevelType w:val="singleLevel"/>
     <w:tmpl w:val="04160001"/>
     <w:lvl w:ilvl="0">
@@ -5057,7 +5201,7 @@
     </w:lvl>
   </w:abstractNum>
   <w:abstractNum w:abstractNumId="12" w15:restartNumberingAfterBreak="0">
-    <w:nsid w:val="43E97818"/>
+    <w:nsid w:val="4BF24F3D"/>
     <w:multiLevelType w:val="singleLevel"/>
     <w:tmpl w:val="04160001"/>
     <w:lvl w:ilvl="0">
@@ -5074,7 +5218,7 @@
     </w:lvl>
   </w:abstractNum>
   <w:abstractNum w:abstractNumId="13" w15:restartNumberingAfterBreak="0">
-    <w:nsid w:val="47781110"/>
+    <w:nsid w:val="4F2C1131"/>
     <w:multiLevelType w:val="singleLevel"/>
     <w:tmpl w:val="04160001"/>
     <w:lvl w:ilvl="0">
@@ -5091,7 +5235,7 @@
     </w:lvl>
   </w:abstractNum>
   <w:abstractNum w:abstractNumId="14" w15:restartNumberingAfterBreak="0">
-    <w:nsid w:val="586B3AF6"/>
+    <w:nsid w:val="535060A9"/>
     <w:multiLevelType w:val="singleLevel"/>
     <w:tmpl w:val="04160001"/>
     <w:lvl w:ilvl="0">
@@ -5108,7 +5252,7 @@
     </w:lvl>
   </w:abstractNum>
   <w:abstractNum w:abstractNumId="15" w15:restartNumberingAfterBreak="0">
-    <w:nsid w:val="5B080E60"/>
+    <w:nsid w:val="56AA03E8"/>
     <w:multiLevelType w:val="singleLevel"/>
     <w:tmpl w:val="04160001"/>
     <w:lvl w:ilvl="0">
@@ -5125,7 +5269,7 @@
     </w:lvl>
   </w:abstractNum>
   <w:abstractNum w:abstractNumId="16" w15:restartNumberingAfterBreak="0">
-    <w:nsid w:val="62DC53E2"/>
+    <w:nsid w:val="58A2146A"/>
     <w:multiLevelType w:val="singleLevel"/>
     <w:tmpl w:val="04160001"/>
     <w:lvl w:ilvl="0">
@@ -5142,7 +5286,7 @@
     </w:lvl>
   </w:abstractNum>
   <w:abstractNum w:abstractNumId="17" w15:restartNumberingAfterBreak="0">
-    <w:nsid w:val="65216209"/>
+    <w:nsid w:val="67A32CAD"/>
     <w:multiLevelType w:val="singleLevel"/>
     <w:tmpl w:val="04160001"/>
     <w:lvl w:ilvl="0">
@@ -5159,7 +5303,7 @@
     </w:lvl>
   </w:abstractNum>
   <w:abstractNum w:abstractNumId="18" w15:restartNumberingAfterBreak="0">
-    <w:nsid w:val="71B63518"/>
+    <w:nsid w:val="71EE00F5"/>
     <w:multiLevelType w:val="singleLevel"/>
     <w:tmpl w:val="04160001"/>
     <w:lvl w:ilvl="0">
@@ -5176,7 +5320,7 @@
     </w:lvl>
   </w:abstractNum>
   <w:abstractNum w:abstractNumId="19" w15:restartNumberingAfterBreak="0">
-    <w:nsid w:val="71DB296D"/>
+    <w:nsid w:val="73C50B94"/>
     <w:multiLevelType w:val="singleLevel"/>
     <w:tmpl w:val="04160001"/>
     <w:lvl w:ilvl="0">
@@ -5193,7 +5337,7 @@
     </w:lvl>
   </w:abstractNum>
   <w:abstractNum w:abstractNumId="20" w15:restartNumberingAfterBreak="0">
-    <w:nsid w:val="752C7290"/>
+    <w:nsid w:val="75C90332"/>
     <w:multiLevelType w:val="singleLevel"/>
     <w:tmpl w:val="04160001"/>
     <w:lvl w:ilvl="0">
@@ -5209,68 +5353,88 @@
       </w:rPr>
     </w:lvl>
   </w:abstractNum>
-  <w:num w:numId="1" w16cid:durableId="1689334463">
-    <w:abstractNumId w:val="0"/>
+  <w:abstractNum w:abstractNumId="21" w15:restartNumberingAfterBreak="0">
+    <w:nsid w:val="7EE7317F"/>
+    <w:multiLevelType w:val="singleLevel"/>
+    <w:tmpl w:val="04160001"/>
+    <w:lvl w:ilvl="0">
+      <w:start w:val="1"/>
+      <w:numFmt w:val="bullet"/>
+      <w:lvlText w:val=""/>
+      <w:lvlJc w:val="left"/>
+      <w:pPr>
+        <w:ind w:left="720" w:hanging="360"/>
+      </w:pPr>
+      <w:rPr>
+        <w:rFonts w:ascii="Symbol" w:hAnsi="Symbol" w:hint="default"/>
+      </w:rPr>
+    </w:lvl>
+  </w:abstractNum>
+  <w:num w:numId="1" w16cid:durableId="259989872">
+    <w:abstractNumId w:val="1"/>
   </w:num>
-  <w:num w:numId="2" w16cid:durableId="1468012716">
+  <w:num w:numId="2" w16cid:durableId="658462443">
+    <w:abstractNumId w:val="10"/>
+  </w:num>
+  <w:num w:numId="3" w16cid:durableId="2109346527">
+    <w:abstractNumId w:val="8"/>
+  </w:num>
+  <w:num w:numId="4" w16cid:durableId="1024480563">
+    <w:abstractNumId w:val="9"/>
+  </w:num>
+  <w:num w:numId="5" w16cid:durableId="250050793">
+    <w:abstractNumId w:val="13"/>
+  </w:num>
+  <w:num w:numId="6" w16cid:durableId="708190270">
+    <w:abstractNumId w:val="3"/>
+  </w:num>
+  <w:num w:numId="7" w16cid:durableId="739014376">
+    <w:abstractNumId w:val="20"/>
+  </w:num>
+  <w:num w:numId="8" w16cid:durableId="906376974">
+    <w:abstractNumId w:val="16"/>
+  </w:num>
+  <w:num w:numId="9" w16cid:durableId="4407674">
+    <w:abstractNumId w:val="4"/>
+  </w:num>
+  <w:num w:numId="10" w16cid:durableId="1613708272">
+    <w:abstractNumId w:val="6"/>
+  </w:num>
+  <w:num w:numId="11" w16cid:durableId="2045053280">
+    <w:abstractNumId w:val="14"/>
+  </w:num>
+  <w:num w:numId="12" w16cid:durableId="2132480990">
+    <w:abstractNumId w:val="18"/>
+  </w:num>
+  <w:num w:numId="13" w16cid:durableId="1837071475">
+    <w:abstractNumId w:val="7"/>
+  </w:num>
+  <w:num w:numId="14" w16cid:durableId="114718041">
+    <w:abstractNumId w:val="5"/>
+  </w:num>
+  <w:num w:numId="15" w16cid:durableId="910039881">
+    <w:abstractNumId w:val="19"/>
+  </w:num>
+  <w:num w:numId="16" w16cid:durableId="1591113010">
+    <w:abstractNumId w:val="12"/>
+  </w:num>
+  <w:num w:numId="17" w16cid:durableId="2093239073">
+    <w:abstractNumId w:val="17"/>
+  </w:num>
+  <w:num w:numId="18" w16cid:durableId="1750688190">
+    <w:abstractNumId w:val="21"/>
+  </w:num>
+  <w:num w:numId="19" w16cid:durableId="309211387">
+    <w:abstractNumId w:val="15"/>
+  </w:num>
+  <w:num w:numId="20" w16cid:durableId="1950962561">
     <w:abstractNumId w:val="11"/>
   </w:num>
-  <w:num w:numId="3" w16cid:durableId="2010861694">
-    <w:abstractNumId w:val="9"/>
+  <w:num w:numId="21" w16cid:durableId="1323194223">
+    <w:abstractNumId w:val="2"/>
   </w:num>
-  <w:num w:numId="4" w16cid:durableId="1189566952">
-    <w:abstractNumId w:val="17"/>
-  </w:num>
-  <w:num w:numId="5" w16cid:durableId="1798448614">
-    <w:abstractNumId w:val="3"/>
-  </w:num>
-  <w:num w:numId="6" w16cid:durableId="344137223">
-    <w:abstractNumId w:val="8"/>
-  </w:num>
-  <w:num w:numId="7" w16cid:durableId="1181972086">
-    <w:abstractNumId w:val="14"/>
-  </w:num>
-  <w:num w:numId="8" w16cid:durableId="1979336530">
-    <w:abstractNumId w:val="13"/>
-  </w:num>
-  <w:num w:numId="9" w16cid:durableId="1072778020">
-    <w:abstractNumId w:val="18"/>
-  </w:num>
-  <w:num w:numId="10" w16cid:durableId="1862550786">
-    <w:abstractNumId w:val="7"/>
-  </w:num>
-  <w:num w:numId="11" w16cid:durableId="1314483682">
-    <w:abstractNumId w:val="12"/>
-  </w:num>
-  <w:num w:numId="12" w16cid:durableId="263807251">
-    <w:abstractNumId w:val="16"/>
-  </w:num>
-  <w:num w:numId="13" w16cid:durableId="1097099438">
-    <w:abstractNumId w:val="5"/>
-  </w:num>
-  <w:num w:numId="14" w16cid:durableId="969015946">
-    <w:abstractNumId w:val="4"/>
-  </w:num>
-  <w:num w:numId="15" w16cid:durableId="985470015">
-    <w:abstractNumId w:val="20"/>
-  </w:num>
-  <w:num w:numId="16" w16cid:durableId="1088623823">
-    <w:abstractNumId w:val="19"/>
-  </w:num>
-  <w:num w:numId="17" w16cid:durableId="1188064184">
-    <w:abstractNumId w:val="10"/>
-  </w:num>
-  <w:num w:numId="18" w16cid:durableId="243691135">
-    <w:abstractNumId w:val="15"/>
-  </w:num>
-  <w:num w:numId="19" w16cid:durableId="836337376">
-    <w:abstractNumId w:val="6"/>
-  </w:num>
-  <w:num w:numId="20" w16cid:durableId="671222924">
-    <w:abstractNumId w:val="1"/>
-  </w:num>
-  <w:num w:numId="21" w16cid:durableId="1310328732">
-    <w:abstractNumId w:val="2"/>
+  <w:num w:numId="22" w16cid:durableId="1089548077">
+    <w:abstractNumId w:val="0"/>
   </w:num>
 </w:numbering>
 </file>
@@ -5683,7 +5847,7 @@
     <w:link w:val="Ttulo1Char"/>
     <w:uiPriority w:val="9"/>
     <w:qFormat/>
-    <w:rsid w:val="0023446A"/>
+    <w:rsid w:val="00784486"/>
     <w:pPr>
       <w:keepNext/>
       <w:keepLines/>
@@ -5706,7 +5870,7 @@
     <w:semiHidden/>
     <w:unhideWhenUsed/>
     <w:qFormat/>
-    <w:rsid w:val="0023446A"/>
+    <w:rsid w:val="00784486"/>
     <w:pPr>
       <w:keepNext/>
       <w:keepLines/>
@@ -5729,7 +5893,7 @@
     <w:semiHidden/>
     <w:unhideWhenUsed/>
     <w:qFormat/>
-    <w:rsid w:val="0023446A"/>
+    <w:rsid w:val="00784486"/>
     <w:pPr>
       <w:keepNext/>
       <w:keepLines/>
@@ -5752,7 +5916,7 @@
     <w:semiHidden/>
     <w:unhideWhenUsed/>
     <w:qFormat/>
-    <w:rsid w:val="0023446A"/>
+    <w:rsid w:val="00784486"/>
     <w:pPr>
       <w:keepNext/>
       <w:keepLines/>
@@ -5775,7 +5939,7 @@
     <w:semiHidden/>
     <w:unhideWhenUsed/>
     <w:qFormat/>
-    <w:rsid w:val="0023446A"/>
+    <w:rsid w:val="00784486"/>
     <w:pPr>
       <w:keepNext/>
       <w:keepLines/>
@@ -5796,7 +5960,7 @@
     <w:semiHidden/>
     <w:unhideWhenUsed/>
     <w:qFormat/>
-    <w:rsid w:val="0023446A"/>
+    <w:rsid w:val="00784486"/>
     <w:pPr>
       <w:keepNext/>
       <w:keepLines/>
@@ -5819,7 +5983,7 @@
     <w:semiHidden/>
     <w:unhideWhenUsed/>
     <w:qFormat/>
-    <w:rsid w:val="0023446A"/>
+    <w:rsid w:val="00784486"/>
     <w:pPr>
       <w:keepNext/>
       <w:keepLines/>
@@ -5840,7 +6004,7 @@
     <w:semiHidden/>
     <w:unhideWhenUsed/>
     <w:qFormat/>
-    <w:rsid w:val="0023446A"/>
+    <w:rsid w:val="00784486"/>
     <w:pPr>
       <w:keepNext/>
       <w:keepLines/>
@@ -5863,7 +6027,7 @@
     <w:semiHidden/>
     <w:unhideWhenUsed/>
     <w:qFormat/>
-    <w:rsid w:val="0023446A"/>
+    <w:rsid w:val="00784486"/>
     <w:pPr>
       <w:keepNext/>
       <w:keepLines/>
@@ -5907,7 +6071,7 @@
     <w:basedOn w:val="Fontepargpadro"/>
     <w:link w:val="Ttulo1"/>
     <w:uiPriority w:val="9"/>
-    <w:rsid w:val="0023446A"/>
+    <w:rsid w:val="00784486"/>
     <w:rPr>
       <w:rFonts w:asciiTheme="majorHAnsi" w:eastAsiaTheme="majorEastAsia" w:hAnsiTheme="majorHAnsi" w:cstheme="majorBidi"/>
       <w:color w:val="0F4761" w:themeColor="accent1" w:themeShade="BF"/>
@@ -5921,7 +6085,7 @@
     <w:link w:val="Ttulo2"/>
     <w:uiPriority w:val="9"/>
     <w:semiHidden/>
-    <w:rsid w:val="0023446A"/>
+    <w:rsid w:val="00784486"/>
     <w:rPr>
       <w:rFonts w:asciiTheme="majorHAnsi" w:eastAsiaTheme="majorEastAsia" w:hAnsiTheme="majorHAnsi" w:cstheme="majorBidi"/>
       <w:color w:val="0F4761" w:themeColor="accent1" w:themeShade="BF"/>
@@ -5935,7 +6099,7 @@
     <w:link w:val="Ttulo3"/>
     <w:uiPriority w:val="9"/>
     <w:semiHidden/>
-    <w:rsid w:val="0023446A"/>
+    <w:rsid w:val="00784486"/>
     <w:rPr>
       <w:rFonts w:eastAsiaTheme="majorEastAsia" w:cstheme="majorBidi"/>
       <w:color w:val="0F4761" w:themeColor="accent1" w:themeShade="BF"/>
@@ -5949,7 +6113,7 @@
     <w:link w:val="Ttulo4"/>
     <w:uiPriority w:val="9"/>
     <w:semiHidden/>
-    <w:rsid w:val="0023446A"/>
+    <w:rsid w:val="00784486"/>
     <w:rPr>
       <w:rFonts w:eastAsiaTheme="majorEastAsia" w:cstheme="majorBidi"/>
       <w:i/>
@@ -5963,7 +6127,7 @@
     <w:link w:val="Ttulo5"/>
     <w:uiPriority w:val="9"/>
     <w:semiHidden/>
-    <w:rsid w:val="0023446A"/>
+    <w:rsid w:val="00784486"/>
     <w:rPr>
       <w:rFonts w:eastAsiaTheme="majorEastAsia" w:cstheme="majorBidi"/>
       <w:color w:val="0F4761" w:themeColor="accent1" w:themeShade="BF"/>
@@ -5975,7 +6139,7 @@
     <w:link w:val="Ttulo6"/>
     <w:uiPriority w:val="9"/>
     <w:semiHidden/>
-    <w:rsid w:val="0023446A"/>
+    <w:rsid w:val="00784486"/>
     <w:rPr>
       <w:rFonts w:eastAsiaTheme="majorEastAsia" w:cstheme="majorBidi"/>
       <w:i/>
@@ -5989,7 +6153,7 @@
     <w:link w:val="Ttulo7"/>
     <w:uiPriority w:val="9"/>
     <w:semiHidden/>
-    <w:rsid w:val="0023446A"/>
+    <w:rsid w:val="00784486"/>
     <w:rPr>
       <w:rFonts w:eastAsiaTheme="majorEastAsia" w:cstheme="majorBidi"/>
       <w:color w:val="595959" w:themeColor="text1" w:themeTint="A6"/>
@@ -6001,7 +6165,7 @@
     <w:link w:val="Ttulo8"/>
     <w:uiPriority w:val="9"/>
     <w:semiHidden/>
-    <w:rsid w:val="0023446A"/>
+    <w:rsid w:val="00784486"/>
     <w:rPr>
       <w:rFonts w:eastAsiaTheme="majorEastAsia" w:cstheme="majorBidi"/>
       <w:i/>
@@ -6015,7 +6179,7 @@
     <w:link w:val="Ttulo9"/>
     <w:uiPriority w:val="9"/>
     <w:semiHidden/>
-    <w:rsid w:val="0023446A"/>
+    <w:rsid w:val="00784486"/>
     <w:rPr>
       <w:rFonts w:eastAsiaTheme="majorEastAsia" w:cstheme="majorBidi"/>
       <w:color w:val="272727" w:themeColor="text1" w:themeTint="D8"/>
@@ -6028,7 +6192,7 @@
     <w:link w:val="TtuloChar"/>
     <w:uiPriority w:val="10"/>
     <w:qFormat/>
-    <w:rsid w:val="0023446A"/>
+    <w:rsid w:val="00784486"/>
     <w:pPr>
       <w:spacing w:after="80" w:line="240" w:lineRule="auto"/>
       <w:contextualSpacing/>
@@ -6046,7 +6210,7 @@
     <w:basedOn w:val="Fontepargpadro"/>
     <w:link w:val="Ttulo"/>
     <w:uiPriority w:val="10"/>
-    <w:rsid w:val="0023446A"/>
+    <w:rsid w:val="00784486"/>
     <w:rPr>
       <w:rFonts w:asciiTheme="majorHAnsi" w:eastAsiaTheme="majorEastAsia" w:hAnsiTheme="majorHAnsi" w:cstheme="majorBidi"/>
       <w:spacing w:val="-10"/>
@@ -6062,7 +6226,7 @@
     <w:link w:val="SubttuloChar"/>
     <w:uiPriority w:val="11"/>
     <w:qFormat/>
-    <w:rsid w:val="0023446A"/>
+    <w:rsid w:val="00784486"/>
     <w:pPr>
       <w:numPr>
         <w:ilvl w:val="1"/>
@@ -6081,7 +6245,7 @@
     <w:basedOn w:val="Fontepargpadro"/>
     <w:link w:val="Subttulo"/>
     <w:uiPriority w:val="11"/>
-    <w:rsid w:val="0023446A"/>
+    <w:rsid w:val="00784486"/>
     <w:rPr>
       <w:rFonts w:eastAsiaTheme="majorEastAsia" w:cstheme="majorBidi"/>
       <w:color w:val="595959" w:themeColor="text1" w:themeTint="A6"/>
@@ -6097,7 +6261,7 @@
     <w:link w:val="CitaoChar"/>
     <w:uiPriority w:val="29"/>
     <w:qFormat/>
-    <w:rsid w:val="0023446A"/>
+    <w:rsid w:val="00784486"/>
     <w:pPr>
       <w:spacing w:before="160"/>
       <w:jc w:val="center"/>
@@ -6113,7 +6277,7 @@
     <w:basedOn w:val="Fontepargpadro"/>
     <w:link w:val="Citao"/>
     <w:uiPriority w:val="29"/>
-    <w:rsid w:val="0023446A"/>
+    <w:rsid w:val="00784486"/>
     <w:rPr>
       <w:i/>
       <w:iCs/>
@@ -6125,7 +6289,7 @@
     <w:basedOn w:val="Normal"/>
     <w:uiPriority w:val="34"/>
     <w:qFormat/>
-    <w:rsid w:val="0023446A"/>
+    <w:rsid w:val="00784486"/>
     <w:pPr>
       <w:ind w:left="720"/>
       <w:contextualSpacing/>
@@ -6136,7 +6300,7 @@
     <w:basedOn w:val="Fontepargpadro"/>
     <w:uiPriority w:val="21"/>
     <w:qFormat/>
-    <w:rsid w:val="0023446A"/>
+    <w:rsid w:val="00784486"/>
     <w:rPr>
       <w:i/>
       <w:iCs/>
@@ -6150,7 +6314,7 @@
     <w:link w:val="CitaoIntensaChar"/>
     <w:uiPriority w:val="30"/>
     <w:qFormat/>
-    <w:rsid w:val="0023446A"/>
+    <w:rsid w:val="00784486"/>
     <w:pPr>
       <w:pBdr>
         <w:top w:val="single" w:sz="4" w:space="10" w:color="0F4761" w:themeColor="accent1" w:themeShade="BF"/>
@@ -6171,7 +6335,7 @@
     <w:basedOn w:val="Fontepargpadro"/>
     <w:link w:val="CitaoIntensa"/>
     <w:uiPriority w:val="30"/>
-    <w:rsid w:val="0023446A"/>
+    <w:rsid w:val="00784486"/>
     <w:rPr>
       <w:i/>
       <w:iCs/>
@@ -6183,7 +6347,7 @@
     <w:basedOn w:val="Fontepargpadro"/>
     <w:uiPriority w:val="32"/>
     <w:qFormat/>
-    <w:rsid w:val="0023446A"/>
+    <w:rsid w:val="00784486"/>
     <w:rPr>
       <w:b/>
       <w:bCs/>

</xml_diff>

<commit_message>
Sincroniza com a produção — nota de que o RLS do kv_store agora aplica a regra de edição/exclusão
Co-Authored-By: Claude Sonnet 5 <noreply@anthropic.com>
</commit_message>
<xml_diff>
--- a/Regras de Acesso e Permissoes - Sistema UNIALFA.docx
+++ b/Regras de Acesso e Permissoes - Sistema UNIALFA.docx
@@ -3321,16 +3321,33 @@
     </w:p>
     <w:p>
       <w:pPr>
-        <w:spacing w:before="120" w:after="200" w:line="260" w:lineRule="auto"/>
-        <w:rPr>
-          <w:color w:val="1A1A1A"/>
-          <w:sz w:val="22"/>
-        </w:rPr>
-      </w:pPr>
-    </w:p>
-    <w:p>
-      <w:pPr>
-        <w:spacing w:before="360" w:line="260" w:lineRule="auto"/>
+        <w:spacing w:before="240" w:line="280" w:lineRule="auto"/>
+        <w:rPr>
+          <w:color w:val="1A1A1A"/>
+          <w:sz w:val="22"/>
+        </w:rPr>
+      </w:pPr>
+      <w:r>
+        <w:rPr>
+          <w:color w:val="1A1A1A"/>
+          <w:sz w:val="22"/>
+        </w:rPr>
+        <w:lastRenderedPageBreak/>
+        <w:t>Desde 15/09/2026, essa regra tambem e aplicada diretamente no banco de dados (politicas de RLS na tabela kv_store), nao so no JavaScript do navegador - alguem tentando editar ou excluir um registro sem permissao direto pela API, contornando a tela do sistema, tambem e bloqueado. Fica documentado no arquivo supabase/migrations/20260915143738_kv_store_row_level_access_control.sql do repositorio. Duas coisas ficaram de fora dessa camada de banco, so continuam no JavaScript: a decisao especifica de quem aprova o Gate 1/Gate 2 (mais restrita que a regra geral de edicao) e as regras dos 3 relatorios de chave unica (secao 3.7 e o Gate 2 do Relatorio de Entregas).</w:t>
+      </w:r>
+    </w:p>
+    <w:p>
+      <w:pPr>
+        <w:spacing w:before="120" w:after="200" w:line="280" w:lineRule="auto"/>
+        <w:rPr>
+          <w:color w:val="1A1A1A"/>
+          <w:sz w:val="22"/>
+        </w:rPr>
+      </w:pPr>
+    </w:p>
+    <w:p>
+      <w:pPr>
+        <w:spacing w:before="360" w:line="280" w:lineRule="auto"/>
         <w:rPr>
           <w:b/>
           <w:color w:val="1A1A1A"/>
@@ -3384,7 +3401,7 @@
           </w:tcPr>
           <w:p>
             <w:pPr>
-              <w:spacing w:before="360" w:line="260" w:lineRule="auto"/>
+              <w:spacing w:before="360" w:line="280" w:lineRule="auto"/>
               <w:rPr>
                 <w:b/>
                 <w:color w:val="FFFFFF"/>
@@ -3408,7 +3425,7 @@
           </w:tcPr>
           <w:p>
             <w:pPr>
-              <w:spacing w:before="360" w:line="260" w:lineRule="auto"/>
+              <w:spacing w:before="360" w:line="280" w:lineRule="auto"/>
               <w:rPr>
                 <w:b/>
                 <w:color w:val="FFFFFF"/>
@@ -3432,7 +3449,7 @@
           </w:tcPr>
           <w:p>
             <w:pPr>
-              <w:spacing w:before="360" w:line="260" w:lineRule="auto"/>
+              <w:spacing w:before="360" w:line="280" w:lineRule="auto"/>
               <w:rPr>
                 <w:b/>
                 <w:color w:val="FFFFFF"/>
@@ -3456,7 +3473,7 @@
           </w:tcPr>
           <w:p>
             <w:pPr>
-              <w:spacing w:before="360" w:line="260" w:lineRule="auto"/>
+              <w:spacing w:before="360" w:line="280" w:lineRule="auto"/>
               <w:rPr>
                 <w:b/>
                 <w:color w:val="FFFFFF"/>
@@ -3487,7 +3504,7 @@
           </w:tcPr>
           <w:p>
             <w:pPr>
-              <w:spacing w:before="360" w:line="260" w:lineRule="auto"/>
+              <w:spacing w:before="360" w:line="280" w:lineRule="auto"/>
               <w:rPr>
                 <w:color w:val="1A1A1A"/>
                 <w:sz w:val="19"/>
@@ -3508,7 +3525,7 @@
           </w:tcPr>
           <w:p>
             <w:pPr>
-              <w:spacing w:before="360" w:line="260" w:lineRule="auto"/>
+              <w:spacing w:before="360" w:line="280" w:lineRule="auto"/>
               <w:rPr>
                 <w:color w:val="1A1A1A"/>
                 <w:sz w:val="19"/>
@@ -3529,7 +3546,7 @@
           </w:tcPr>
           <w:p>
             <w:pPr>
-              <w:spacing w:before="360" w:line="260" w:lineRule="auto"/>
+              <w:spacing w:before="360" w:line="280" w:lineRule="auto"/>
               <w:rPr>
                 <w:color w:val="1A1A1A"/>
                 <w:sz w:val="19"/>
@@ -3550,7 +3567,7 @@
           </w:tcPr>
           <w:p>
             <w:pPr>
-              <w:spacing w:before="360" w:line="260" w:lineRule="auto"/>
+              <w:spacing w:before="360" w:line="280" w:lineRule="auto"/>
               <w:rPr>
                 <w:color w:val="1A1A1A"/>
                 <w:sz w:val="19"/>
@@ -3579,7 +3596,7 @@
           </w:tcPr>
           <w:p>
             <w:pPr>
-              <w:spacing w:before="360" w:line="260" w:lineRule="auto"/>
+              <w:spacing w:before="360" w:line="280" w:lineRule="auto"/>
               <w:rPr>
                 <w:color w:val="1A1A1A"/>
                 <w:sz w:val="19"/>
@@ -3600,7 +3617,7 @@
           </w:tcPr>
           <w:p>
             <w:pPr>
-              <w:spacing w:before="360" w:line="260" w:lineRule="auto"/>
+              <w:spacing w:before="360" w:line="280" w:lineRule="auto"/>
               <w:rPr>
                 <w:color w:val="1A1A1A"/>
                 <w:sz w:val="19"/>
@@ -3621,7 +3638,7 @@
           </w:tcPr>
           <w:p>
             <w:pPr>
-              <w:spacing w:before="360" w:line="260" w:lineRule="auto"/>
+              <w:spacing w:before="360" w:line="280" w:lineRule="auto"/>
               <w:rPr>
                 <w:color w:val="1A1A1A"/>
                 <w:sz w:val="19"/>
@@ -3642,7 +3659,7 @@
           </w:tcPr>
           <w:p>
             <w:pPr>
-              <w:spacing w:before="360" w:line="260" w:lineRule="auto"/>
+              <w:spacing w:before="360" w:line="280" w:lineRule="auto"/>
               <w:rPr>
                 <w:color w:val="1A1A1A"/>
                 <w:sz w:val="19"/>
@@ -3671,7 +3688,7 @@
           </w:tcPr>
           <w:p>
             <w:pPr>
-              <w:spacing w:before="360" w:line="260" w:lineRule="auto"/>
+              <w:spacing w:before="360" w:line="280" w:lineRule="auto"/>
               <w:rPr>
                 <w:color w:val="1A1A1A"/>
                 <w:sz w:val="19"/>
@@ -3692,7 +3709,7 @@
           </w:tcPr>
           <w:p>
             <w:pPr>
-              <w:spacing w:before="360" w:line="260" w:lineRule="auto"/>
+              <w:spacing w:before="360" w:line="280" w:lineRule="auto"/>
               <w:rPr>
                 <w:color w:val="1A1A1A"/>
                 <w:sz w:val="19"/>
@@ -3713,7 +3730,7 @@
           </w:tcPr>
           <w:p>
             <w:pPr>
-              <w:spacing w:before="360" w:line="260" w:lineRule="auto"/>
+              <w:spacing w:before="360" w:line="280" w:lineRule="auto"/>
               <w:rPr>
                 <w:color w:val="1A1A1A"/>
                 <w:sz w:val="19"/>
@@ -3734,7 +3751,7 @@
           </w:tcPr>
           <w:p>
             <w:pPr>
-              <w:spacing w:before="360" w:line="260" w:lineRule="auto"/>
+              <w:spacing w:before="360" w:line="280" w:lineRule="auto"/>
               <w:rPr>
                 <w:color w:val="1A1A1A"/>
                 <w:sz w:val="19"/>
@@ -3763,7 +3780,7 @@
           </w:tcPr>
           <w:p>
             <w:pPr>
-              <w:spacing w:before="360" w:line="260" w:lineRule="auto"/>
+              <w:spacing w:before="360" w:line="280" w:lineRule="auto"/>
               <w:rPr>
                 <w:color w:val="1A1A1A"/>
                 <w:sz w:val="19"/>
@@ -3784,7 +3801,7 @@
           </w:tcPr>
           <w:p>
             <w:pPr>
-              <w:spacing w:before="360" w:line="260" w:lineRule="auto"/>
+              <w:spacing w:before="360" w:line="280" w:lineRule="auto"/>
               <w:rPr>
                 <w:color w:val="1A1A1A"/>
                 <w:sz w:val="19"/>
@@ -3805,7 +3822,7 @@
           </w:tcPr>
           <w:p>
             <w:pPr>
-              <w:spacing w:before="360" w:line="260" w:lineRule="auto"/>
+              <w:spacing w:before="360" w:line="280" w:lineRule="auto"/>
               <w:rPr>
                 <w:color w:val="1A1A1A"/>
                 <w:sz w:val="19"/>
@@ -3826,7 +3843,7 @@
           </w:tcPr>
           <w:p>
             <w:pPr>
-              <w:spacing w:before="360" w:line="260" w:lineRule="auto"/>
+              <w:spacing w:before="360" w:line="280" w:lineRule="auto"/>
               <w:rPr>
                 <w:color w:val="1A1A1A"/>
                 <w:sz w:val="19"/>
@@ -3855,7 +3872,7 @@
           </w:tcPr>
           <w:p>
             <w:pPr>
-              <w:spacing w:before="360" w:line="260" w:lineRule="auto"/>
+              <w:spacing w:before="360" w:line="280" w:lineRule="auto"/>
               <w:rPr>
                 <w:color w:val="1A1A1A"/>
                 <w:sz w:val="19"/>
@@ -3876,7 +3893,7 @@
           </w:tcPr>
           <w:p>
             <w:pPr>
-              <w:spacing w:before="360" w:line="260" w:lineRule="auto"/>
+              <w:spacing w:before="360" w:line="280" w:lineRule="auto"/>
               <w:rPr>
                 <w:color w:val="1A1A1A"/>
                 <w:sz w:val="19"/>
@@ -3897,7 +3914,7 @@
           </w:tcPr>
           <w:p>
             <w:pPr>
-              <w:spacing w:before="360" w:line="260" w:lineRule="auto"/>
+              <w:spacing w:before="360" w:line="280" w:lineRule="auto"/>
               <w:rPr>
                 <w:color w:val="1A1A1A"/>
                 <w:sz w:val="19"/>
@@ -3918,7 +3935,7 @@
           </w:tcPr>
           <w:p>
             <w:pPr>
-              <w:spacing w:before="360" w:line="260" w:lineRule="auto"/>
+              <w:spacing w:before="360" w:line="280" w:lineRule="auto"/>
               <w:rPr>
                 <w:color w:val="1A1A1A"/>
                 <w:sz w:val="19"/>
@@ -3947,7 +3964,7 @@
           </w:tcPr>
           <w:p>
             <w:pPr>
-              <w:spacing w:before="360" w:line="260" w:lineRule="auto"/>
+              <w:spacing w:before="360" w:line="280" w:lineRule="auto"/>
               <w:rPr>
                 <w:color w:val="1A1A1A"/>
                 <w:sz w:val="19"/>
@@ -3968,7 +3985,7 @@
           </w:tcPr>
           <w:p>
             <w:pPr>
-              <w:spacing w:before="360" w:line="260" w:lineRule="auto"/>
+              <w:spacing w:before="360" w:line="280" w:lineRule="auto"/>
               <w:rPr>
                 <w:color w:val="1A1A1A"/>
                 <w:sz w:val="19"/>
@@ -3989,7 +4006,7 @@
           </w:tcPr>
           <w:p>
             <w:pPr>
-              <w:spacing w:before="360" w:line="260" w:lineRule="auto"/>
+              <w:spacing w:before="360" w:line="280" w:lineRule="auto"/>
               <w:rPr>
                 <w:color w:val="1A1A1A"/>
                 <w:sz w:val="19"/>
@@ -4010,7 +4027,7 @@
           </w:tcPr>
           <w:p>
             <w:pPr>
-              <w:spacing w:before="360" w:line="260" w:lineRule="auto"/>
+              <w:spacing w:before="360" w:line="280" w:lineRule="auto"/>
               <w:rPr>
                 <w:color w:val="1A1A1A"/>
                 <w:sz w:val="19"/>
@@ -4039,7 +4056,7 @@
           </w:tcPr>
           <w:p>
             <w:pPr>
-              <w:spacing w:before="360" w:line="260" w:lineRule="auto"/>
+              <w:spacing w:before="360" w:line="280" w:lineRule="auto"/>
               <w:rPr>
                 <w:color w:val="1A1A1A"/>
                 <w:sz w:val="19"/>
@@ -4060,7 +4077,7 @@
           </w:tcPr>
           <w:p>
             <w:pPr>
-              <w:spacing w:before="360" w:line="260" w:lineRule="auto"/>
+              <w:spacing w:before="360" w:line="280" w:lineRule="auto"/>
               <w:rPr>
                 <w:color w:val="1A1A1A"/>
                 <w:sz w:val="19"/>
@@ -4081,7 +4098,7 @@
           </w:tcPr>
           <w:p>
             <w:pPr>
-              <w:spacing w:before="360" w:line="260" w:lineRule="auto"/>
+              <w:spacing w:before="360" w:line="280" w:lineRule="auto"/>
               <w:rPr>
                 <w:color w:val="1A1A1A"/>
                 <w:sz w:val="19"/>
@@ -4102,7 +4119,7 @@
           </w:tcPr>
           <w:p>
             <w:pPr>
-              <w:spacing w:before="360" w:line="260" w:lineRule="auto"/>
+              <w:spacing w:before="360" w:line="280" w:lineRule="auto"/>
               <w:rPr>
                 <w:color w:val="1A1A1A"/>
                 <w:sz w:val="19"/>
@@ -4131,7 +4148,7 @@
           </w:tcPr>
           <w:p>
             <w:pPr>
-              <w:spacing w:before="360" w:line="260" w:lineRule="auto"/>
+              <w:spacing w:before="360" w:line="280" w:lineRule="auto"/>
               <w:rPr>
                 <w:color w:val="1A1A1A"/>
                 <w:sz w:val="19"/>
@@ -4152,7 +4169,7 @@
           </w:tcPr>
           <w:p>
             <w:pPr>
-              <w:spacing w:before="360" w:line="260" w:lineRule="auto"/>
+              <w:spacing w:before="360" w:line="280" w:lineRule="auto"/>
               <w:rPr>
                 <w:color w:val="1A1A1A"/>
                 <w:sz w:val="19"/>
@@ -4173,7 +4190,7 @@
           </w:tcPr>
           <w:p>
             <w:pPr>
-              <w:spacing w:before="360" w:line="260" w:lineRule="auto"/>
+              <w:spacing w:before="360" w:line="280" w:lineRule="auto"/>
               <w:rPr>
                 <w:color w:val="1A1A1A"/>
                 <w:sz w:val="19"/>
@@ -4194,7 +4211,7 @@
           </w:tcPr>
           <w:p>
             <w:pPr>
-              <w:spacing w:before="360" w:line="260" w:lineRule="auto"/>
+              <w:spacing w:before="360" w:line="280" w:lineRule="auto"/>
               <w:rPr>
                 <w:color w:val="1A1A1A"/>
                 <w:sz w:val="19"/>
@@ -4223,7 +4240,7 @@
           </w:tcPr>
           <w:p>
             <w:pPr>
-              <w:spacing w:before="360" w:line="260" w:lineRule="auto"/>
+              <w:spacing w:before="360" w:line="280" w:lineRule="auto"/>
               <w:rPr>
                 <w:color w:val="1A1A1A"/>
                 <w:sz w:val="19"/>
@@ -4244,7 +4261,7 @@
           </w:tcPr>
           <w:p>
             <w:pPr>
-              <w:spacing w:before="360" w:line="260" w:lineRule="auto"/>
+              <w:spacing w:before="360" w:line="280" w:lineRule="auto"/>
               <w:rPr>
                 <w:color w:val="1A1A1A"/>
                 <w:sz w:val="19"/>
@@ -4265,7 +4282,7 @@
           </w:tcPr>
           <w:p>
             <w:pPr>
-              <w:spacing w:before="360" w:line="260" w:lineRule="auto"/>
+              <w:spacing w:before="360" w:line="280" w:lineRule="auto"/>
               <w:rPr>
                 <w:color w:val="1A1A1A"/>
                 <w:sz w:val="19"/>
@@ -4286,7 +4303,7 @@
           </w:tcPr>
           <w:p>
             <w:pPr>
-              <w:spacing w:before="360" w:line="260" w:lineRule="auto"/>
+              <w:spacing w:before="360" w:line="280" w:lineRule="auto"/>
               <w:rPr>
                 <w:color w:val="1A1A1A"/>
                 <w:sz w:val="19"/>
@@ -4315,17 +4332,18 @@
           </w:tcPr>
           <w:p>
             <w:pPr>
-              <w:spacing w:before="360" w:line="260" w:lineRule="auto"/>
-              <w:rPr>
-                <w:color w:val="1A1A1A"/>
-                <w:sz w:val="19"/>
-              </w:rPr>
-            </w:pPr>
-            <w:r>
-              <w:rPr>
-                <w:color w:val="1A1A1A"/>
-                <w:sz w:val="19"/>
-              </w:rPr>
+              <w:spacing w:before="360" w:line="280" w:lineRule="auto"/>
+              <w:rPr>
+                <w:color w:val="1A1A1A"/>
+                <w:sz w:val="19"/>
+              </w:rPr>
+            </w:pPr>
+            <w:r>
+              <w:rPr>
+                <w:color w:val="1A1A1A"/>
+                <w:sz w:val="19"/>
+              </w:rPr>
+              <w:lastRenderedPageBreak/>
               <w:t>RLA</w:t>
             </w:r>
           </w:p>
@@ -4336,7 +4354,7 @@
           </w:tcPr>
           <w:p>
             <w:pPr>
-              <w:spacing w:before="360" w:line="260" w:lineRule="auto"/>
+              <w:spacing w:before="360" w:line="280" w:lineRule="auto"/>
               <w:rPr>
                 <w:color w:val="1A1A1A"/>
                 <w:sz w:val="19"/>
@@ -4357,7 +4375,7 @@
           </w:tcPr>
           <w:p>
             <w:pPr>
-              <w:spacing w:before="360" w:line="260" w:lineRule="auto"/>
+              <w:spacing w:before="360" w:line="280" w:lineRule="auto"/>
               <w:rPr>
                 <w:color w:val="1A1A1A"/>
                 <w:sz w:val="19"/>
@@ -4378,7 +4396,7 @@
           </w:tcPr>
           <w:p>
             <w:pPr>
-              <w:spacing w:before="360" w:line="260" w:lineRule="auto"/>
+              <w:spacing w:before="360" w:line="280" w:lineRule="auto"/>
               <w:rPr>
                 <w:color w:val="1A1A1A"/>
                 <w:sz w:val="19"/>
@@ -4407,7 +4425,7 @@
           </w:tcPr>
           <w:p>
             <w:pPr>
-              <w:spacing w:before="360" w:line="260" w:lineRule="auto"/>
+              <w:spacing w:before="360" w:line="280" w:lineRule="auto"/>
               <w:rPr>
                 <w:color w:val="1A1A1A"/>
                 <w:sz w:val="19"/>
@@ -4428,7 +4446,7 @@
           </w:tcPr>
           <w:p>
             <w:pPr>
-              <w:spacing w:before="360" w:line="260" w:lineRule="auto"/>
+              <w:spacing w:before="360" w:line="280" w:lineRule="auto"/>
               <w:rPr>
                 <w:color w:val="1A1A1A"/>
                 <w:sz w:val="19"/>
@@ -4449,7 +4467,7 @@
           </w:tcPr>
           <w:p>
             <w:pPr>
-              <w:spacing w:before="360" w:line="260" w:lineRule="auto"/>
+              <w:spacing w:before="360" w:line="280" w:lineRule="auto"/>
               <w:rPr>
                 <w:color w:val="1A1A1A"/>
                 <w:sz w:val="19"/>
@@ -4470,7 +4488,7 @@
           </w:tcPr>
           <w:p>
             <w:pPr>
-              <w:spacing w:before="360" w:line="260" w:lineRule="auto"/>
+              <w:spacing w:before="360" w:line="280" w:lineRule="auto"/>
               <w:rPr>
                 <w:color w:val="1A1A1A"/>
                 <w:sz w:val="19"/>
@@ -4499,7 +4517,7 @@
           </w:tcPr>
           <w:p>
             <w:pPr>
-              <w:spacing w:before="360" w:line="260" w:lineRule="auto"/>
+              <w:spacing w:before="360" w:line="280" w:lineRule="auto"/>
               <w:rPr>
                 <w:color w:val="1A1A1A"/>
                 <w:sz w:val="19"/>
@@ -4520,7 +4538,7 @@
           </w:tcPr>
           <w:p>
             <w:pPr>
-              <w:spacing w:before="360" w:line="260" w:lineRule="auto"/>
+              <w:spacing w:before="360" w:line="280" w:lineRule="auto"/>
               <w:rPr>
                 <w:color w:val="1A1A1A"/>
                 <w:sz w:val="19"/>
@@ -4541,7 +4559,7 @@
           </w:tcPr>
           <w:p>
             <w:pPr>
-              <w:spacing w:before="360" w:line="260" w:lineRule="auto"/>
+              <w:spacing w:before="360" w:line="280" w:lineRule="auto"/>
               <w:rPr>
                 <w:color w:val="1A1A1A"/>
                 <w:sz w:val="19"/>
@@ -4562,7 +4580,7 @@
           </w:tcPr>
           <w:p>
             <w:pPr>
-              <w:spacing w:before="360" w:line="260" w:lineRule="auto"/>
+              <w:spacing w:before="360" w:line="280" w:lineRule="auto"/>
               <w:rPr>
                 <w:color w:val="1A1A1A"/>
                 <w:sz w:val="19"/>
@@ -4591,7 +4609,7 @@
           </w:tcPr>
           <w:p>
             <w:pPr>
-              <w:spacing w:before="360" w:line="260" w:lineRule="auto"/>
+              <w:spacing w:before="360" w:line="280" w:lineRule="auto"/>
               <w:rPr>
                 <w:color w:val="1A1A1A"/>
                 <w:sz w:val="19"/>
@@ -4612,7 +4630,7 @@
           </w:tcPr>
           <w:p>
             <w:pPr>
-              <w:spacing w:before="360" w:line="260" w:lineRule="auto"/>
+              <w:spacing w:before="360" w:line="280" w:lineRule="auto"/>
               <w:rPr>
                 <w:color w:val="1A1A1A"/>
                 <w:sz w:val="19"/>
@@ -4633,7 +4651,7 @@
           </w:tcPr>
           <w:p>
             <w:pPr>
-              <w:spacing w:before="360" w:line="260" w:lineRule="auto"/>
+              <w:spacing w:before="360" w:line="280" w:lineRule="auto"/>
               <w:rPr>
                 <w:color w:val="1A1A1A"/>
                 <w:sz w:val="19"/>
@@ -4654,7 +4672,7 @@
           </w:tcPr>
           <w:p>
             <w:pPr>
-              <w:spacing w:before="360" w:line="260" w:lineRule="auto"/>
+              <w:spacing w:before="360" w:line="280" w:lineRule="auto"/>
               <w:rPr>
                 <w:color w:val="1A1A1A"/>
                 <w:sz w:val="19"/>
@@ -4683,18 +4701,17 @@
           </w:tcPr>
           <w:p>
             <w:pPr>
-              <w:spacing w:before="360" w:line="260" w:lineRule="auto"/>
-              <w:rPr>
-                <w:color w:val="1A1A1A"/>
-                <w:sz w:val="19"/>
-              </w:rPr>
-            </w:pPr>
-            <w:r>
-              <w:rPr>
-                <w:color w:val="1A1A1A"/>
-                <w:sz w:val="19"/>
-              </w:rPr>
-              <w:lastRenderedPageBreak/>
+              <w:spacing w:before="360" w:line="280" w:lineRule="auto"/>
+              <w:rPr>
+                <w:color w:val="1A1A1A"/>
+                <w:sz w:val="19"/>
+              </w:rPr>
+            </w:pPr>
+            <w:r>
+              <w:rPr>
+                <w:color w:val="1A1A1A"/>
+                <w:sz w:val="19"/>
+              </w:rPr>
               <w:t>Painel Executivo</w:t>
             </w:r>
           </w:p>
@@ -4705,7 +4722,7 @@
           </w:tcPr>
           <w:p>
             <w:pPr>
-              <w:spacing w:before="360" w:line="260" w:lineRule="auto"/>
+              <w:spacing w:before="360" w:line="280" w:lineRule="auto"/>
               <w:rPr>
                 <w:color w:val="1A1A1A"/>
                 <w:sz w:val="19"/>
@@ -4726,7 +4743,7 @@
           </w:tcPr>
           <w:p>
             <w:pPr>
-              <w:spacing w:before="360" w:line="260" w:lineRule="auto"/>
+              <w:spacing w:before="360" w:line="280" w:lineRule="auto"/>
               <w:rPr>
                 <w:color w:val="1A1A1A"/>
                 <w:sz w:val="19"/>
@@ -4747,7 +4764,7 @@
           </w:tcPr>
           <w:p>
             <w:pPr>
-              <w:spacing w:before="360" w:line="260" w:lineRule="auto"/>
+              <w:spacing w:before="360" w:line="280" w:lineRule="auto"/>
               <w:rPr>
                 <w:color w:val="1A1A1A"/>
                 <w:sz w:val="19"/>
@@ -4776,7 +4793,7 @@
           </w:tcPr>
           <w:p>
             <w:pPr>
-              <w:spacing w:before="360" w:line="260" w:lineRule="auto"/>
+              <w:spacing w:before="360" w:line="280" w:lineRule="auto"/>
               <w:rPr>
                 <w:color w:val="1A1A1A"/>
                 <w:sz w:val="19"/>
@@ -4797,7 +4814,7 @@
           </w:tcPr>
           <w:p>
             <w:pPr>
-              <w:spacing w:before="360" w:line="260" w:lineRule="auto"/>
+              <w:spacing w:before="360" w:line="280" w:lineRule="auto"/>
               <w:rPr>
                 <w:color w:val="1A1A1A"/>
                 <w:sz w:val="19"/>
@@ -4818,7 +4835,7 @@
           </w:tcPr>
           <w:p>
             <w:pPr>
-              <w:spacing w:before="360" w:line="260" w:lineRule="auto"/>
+              <w:spacing w:before="360" w:line="280" w:lineRule="auto"/>
               <w:rPr>
                 <w:color w:val="1A1A1A"/>
                 <w:sz w:val="19"/>
@@ -4839,7 +4856,7 @@
           </w:tcPr>
           <w:p>
             <w:pPr>
-              <w:spacing w:before="360" w:line="260" w:lineRule="auto"/>
+              <w:spacing w:before="360" w:line="280" w:lineRule="auto"/>
               <w:rPr>
                 <w:color w:val="1A1A1A"/>
                 <w:sz w:val="19"/>
@@ -4868,7 +4885,7 @@
           </w:tcPr>
           <w:p>
             <w:pPr>
-              <w:spacing w:before="360" w:line="260" w:lineRule="auto"/>
+              <w:spacing w:before="360" w:line="280" w:lineRule="auto"/>
               <w:rPr>
                 <w:color w:val="1A1A1A"/>
                 <w:sz w:val="19"/>
@@ -4889,7 +4906,7 @@
           </w:tcPr>
           <w:p>
             <w:pPr>
-              <w:spacing w:before="360" w:line="260" w:lineRule="auto"/>
+              <w:spacing w:before="360" w:line="280" w:lineRule="auto"/>
               <w:rPr>
                 <w:color w:val="1A1A1A"/>
                 <w:sz w:val="19"/>
@@ -4910,7 +4927,7 @@
           </w:tcPr>
           <w:p>
             <w:pPr>
-              <w:spacing w:before="360" w:line="260" w:lineRule="auto"/>
+              <w:spacing w:before="360" w:line="280" w:lineRule="auto"/>
               <w:rPr>
                 <w:color w:val="1A1A1A"/>
                 <w:sz w:val="19"/>
@@ -4931,7 +4948,7 @@
           </w:tcPr>
           <w:p>
             <w:pPr>
-              <w:spacing w:before="360" w:line="260" w:lineRule="auto"/>
+              <w:spacing w:before="360" w:line="280" w:lineRule="auto"/>
               <w:rPr>
                 <w:color w:val="1A1A1A"/>
                 <w:sz w:val="19"/>
@@ -4950,7 +4967,7 @@
     </w:tbl>
     <w:p>
       <w:pPr>
-        <w:spacing w:before="360" w:line="260" w:lineRule="auto"/>
+        <w:spacing w:before="360" w:line="280" w:lineRule="auto"/>
         <w:rPr>
           <w:color w:val="1A1A1A"/>
           <w:sz w:val="32"/>
@@ -4997,7 +5014,7 @@
 <file path=word/numbering.xml><?xml version="1.0" encoding="utf-8"?>
 <w:numbering xmlns:wpc="http://schemas.microsoft.com/office/word/2010/wordprocessingCanvas" xmlns:cx="http://schemas.microsoft.com/office/drawing/2014/chartex" xmlns:cx1="http://schemas.microsoft.com/office/drawing/2015/9/8/chartex" xmlns:cx2="http://schemas.microsoft.com/office/drawing/2015/10/21/chartex" xmlns:cx3="http://schemas.microsoft.com/office/drawing/2016/5/9/chartex" xmlns:cx4="http://schemas.microsoft.com/office/drawing/2016/5/10/chartex" xmlns:cx5="http://schemas.microsoft.com/office/drawing/2016/5/11/chartex" xmlns:cx6="http://schemas.microsoft.com/office/drawing/2016/5/12/chartex" xmlns:cx7="http://schemas.microsoft.com/office/drawing/2016/5/13/chartex" xmlns:cx8="http://schemas.microsoft.com/office/drawing/2016/5/14/chartex" xmlns:mc="http://schemas.openxmlformats.org/markup-compatibility/2006" xmlns:aink="http://schemas.microsoft.com/office/drawing/2016/ink" xmlns:am3d="http://schemas.microsoft.com/office/drawing/2017/model3d" xmlns:o="urn:schemas-microsoft-com:office:office" xmlns:oel="http://schemas.microsoft.com/office/2019/extlst" xmlns:r="http://schemas.openxmlformats.org/officeDocument/2006/relationships" xmlns:m="http://schemas.openxmlformats.org/officeDocument/2006/math" xmlns:v="urn:schemas-microsoft-com:vml" xmlns:wp14="http://schemas.microsoft.com/office/word/2010/wordprocessingDrawing" xmlns:wp="http://schemas.openxmlformats.org/drawingml/2006/wordprocessingDrawing" xmlns:w10="urn:schemas-microsoft-com:office:word" xmlns:w="http://schemas.openxmlformats.org/wordprocessingml/2006/main" xmlns:w14="http://schemas.microsoft.com/office/word/2010/wordml" xmlns:w15="http://schemas.microsoft.com/office/word/2012/wordml" xmlns:w16cex="http://schemas.microsoft.com/office/word/2018/wordml/cex" xmlns:w16cid="http://schemas.microsoft.com/office/word/2016/wordml/cid" xmlns:w16="http://schemas.microsoft.com/office/word/2018/wordml" xmlns:w16du="http://schemas.microsoft.com/office/word/2023/wordml/word16du" xmlns:w16sdtdh="http://schemas.microsoft.com/office/word/2020/wordml/sdtdatahash" xmlns:w16sdtfl="http://schemas.microsoft.com/office/word/2024/wordml/sdtformatlock" xmlns:w16se="http://schemas.microsoft.com/office/word/2015/wordml/symex" xmlns:wpg="http://schemas.microsoft.com/office/word/2010/wordprocessingGroup" xmlns:wpi="http://schemas.microsoft.com/office/word/2010/wordprocessingInk" xmlns:wne="http://schemas.microsoft.com/office/word/2006/wordml" xmlns:wps="http://schemas.microsoft.com/office/word/2010/wordprocessingShape" mc:Ignorable="w14 w15 w16se w16cid w16 w16cex w16sdtdh w16sdtfl w16du wp14">
   <w:abstractNum w:abstractNumId="0" w15:restartNumberingAfterBreak="0">
-    <w:nsid w:val="029F31BA"/>
+    <w:nsid w:val="052A3CA5"/>
     <w:multiLevelType w:val="singleLevel"/>
     <w:tmpl w:val="04160001"/>
     <w:lvl w:ilvl="0">
@@ -5014,7 +5031,7 @@
     </w:lvl>
   </w:abstractNum>
   <w:abstractNum w:abstractNumId="1" w15:restartNumberingAfterBreak="0">
-    <w:nsid w:val="03FD3EE1"/>
+    <w:nsid w:val="1B66570F"/>
     <w:multiLevelType w:val="singleLevel"/>
     <w:tmpl w:val="04160001"/>
     <w:lvl w:ilvl="0">
@@ -5031,7 +5048,7 @@
     </w:lvl>
   </w:abstractNum>
   <w:abstractNum w:abstractNumId="2" w15:restartNumberingAfterBreak="0">
-    <w:nsid w:val="0B1D194F"/>
+    <w:nsid w:val="1FAE1B7C"/>
     <w:multiLevelType w:val="singleLevel"/>
     <w:tmpl w:val="04160001"/>
     <w:lvl w:ilvl="0">
@@ -5048,7 +5065,7 @@
     </w:lvl>
   </w:abstractNum>
   <w:abstractNum w:abstractNumId="3" w15:restartNumberingAfterBreak="0">
-    <w:nsid w:val="13845D7B"/>
+    <w:nsid w:val="1FF412F8"/>
     <w:multiLevelType w:val="singleLevel"/>
     <w:tmpl w:val="04160001"/>
     <w:lvl w:ilvl="0">
@@ -5065,7 +5082,7 @@
     </w:lvl>
   </w:abstractNum>
   <w:abstractNum w:abstractNumId="4" w15:restartNumberingAfterBreak="0">
-    <w:nsid w:val="15C85F99"/>
+    <w:nsid w:val="2A886871"/>
     <w:multiLevelType w:val="singleLevel"/>
     <w:tmpl w:val="04160001"/>
     <w:lvl w:ilvl="0">
@@ -5082,7 +5099,7 @@
     </w:lvl>
   </w:abstractNum>
   <w:abstractNum w:abstractNumId="5" w15:restartNumberingAfterBreak="0">
-    <w:nsid w:val="22832A0F"/>
+    <w:nsid w:val="3A1152D0"/>
     <w:multiLevelType w:val="singleLevel"/>
     <w:tmpl w:val="04160001"/>
     <w:lvl w:ilvl="0">
@@ -5099,7 +5116,7 @@
     </w:lvl>
   </w:abstractNum>
   <w:abstractNum w:abstractNumId="6" w15:restartNumberingAfterBreak="0">
-    <w:nsid w:val="251D03BE"/>
+    <w:nsid w:val="3C4261CD"/>
     <w:multiLevelType w:val="singleLevel"/>
     <w:tmpl w:val="04160001"/>
     <w:lvl w:ilvl="0">
@@ -5116,7 +5133,7 @@
     </w:lvl>
   </w:abstractNum>
   <w:abstractNum w:abstractNumId="7" w15:restartNumberingAfterBreak="0">
-    <w:nsid w:val="29974A5A"/>
+    <w:nsid w:val="41092C36"/>
     <w:multiLevelType w:val="singleLevel"/>
     <w:tmpl w:val="04160001"/>
     <w:lvl w:ilvl="0">
@@ -5133,7 +5150,7 @@
     </w:lvl>
   </w:abstractNum>
   <w:abstractNum w:abstractNumId="8" w15:restartNumberingAfterBreak="0">
-    <w:nsid w:val="30490ADE"/>
+    <w:nsid w:val="41744BB6"/>
     <w:multiLevelType w:val="singleLevel"/>
     <w:tmpl w:val="04160001"/>
     <w:lvl w:ilvl="0">
@@ -5150,7 +5167,7 @@
     </w:lvl>
   </w:abstractNum>
   <w:abstractNum w:abstractNumId="9" w15:restartNumberingAfterBreak="0">
-    <w:nsid w:val="43210A10"/>
+    <w:nsid w:val="4B567217"/>
     <w:multiLevelType w:val="singleLevel"/>
     <w:tmpl w:val="04160001"/>
     <w:lvl w:ilvl="0">
@@ -5167,7 +5184,7 @@
     </w:lvl>
   </w:abstractNum>
   <w:abstractNum w:abstractNumId="10" w15:restartNumberingAfterBreak="0">
-    <w:nsid w:val="490179F1"/>
+    <w:nsid w:val="4D4769CE"/>
     <w:multiLevelType w:val="singleLevel"/>
     <w:tmpl w:val="04160001"/>
     <w:lvl w:ilvl="0">
@@ -5184,7 +5201,7 @@
     </w:lvl>
   </w:abstractNum>
   <w:abstractNum w:abstractNumId="11" w15:restartNumberingAfterBreak="0">
-    <w:nsid w:val="4ACC3E0E"/>
+    <w:nsid w:val="549223C9"/>
     <w:multiLevelType w:val="singleLevel"/>
     <w:tmpl w:val="04160001"/>
     <w:lvl w:ilvl="0">
@@ -5201,7 +5218,7 @@
     </w:lvl>
   </w:abstractNum>
   <w:abstractNum w:abstractNumId="12" w15:restartNumberingAfterBreak="0">
-    <w:nsid w:val="4BF24F3D"/>
+    <w:nsid w:val="57B16312"/>
     <w:multiLevelType w:val="singleLevel"/>
     <w:tmpl w:val="04160001"/>
     <w:lvl w:ilvl="0">
@@ -5218,7 +5235,7 @@
     </w:lvl>
   </w:abstractNum>
   <w:abstractNum w:abstractNumId="13" w15:restartNumberingAfterBreak="0">
-    <w:nsid w:val="4F2C1131"/>
+    <w:nsid w:val="592704E8"/>
     <w:multiLevelType w:val="singleLevel"/>
     <w:tmpl w:val="04160001"/>
     <w:lvl w:ilvl="0">
@@ -5235,7 +5252,7 @@
     </w:lvl>
   </w:abstractNum>
   <w:abstractNum w:abstractNumId="14" w15:restartNumberingAfterBreak="0">
-    <w:nsid w:val="535060A9"/>
+    <w:nsid w:val="5DB8254D"/>
     <w:multiLevelType w:val="singleLevel"/>
     <w:tmpl w:val="04160001"/>
     <w:lvl w:ilvl="0">
@@ -5252,7 +5269,7 @@
     </w:lvl>
   </w:abstractNum>
   <w:abstractNum w:abstractNumId="15" w15:restartNumberingAfterBreak="0">
-    <w:nsid w:val="56AA03E8"/>
+    <w:nsid w:val="5EE42884"/>
     <w:multiLevelType w:val="singleLevel"/>
     <w:tmpl w:val="04160001"/>
     <w:lvl w:ilvl="0">
@@ -5269,7 +5286,7 @@
     </w:lvl>
   </w:abstractNum>
   <w:abstractNum w:abstractNumId="16" w15:restartNumberingAfterBreak="0">
-    <w:nsid w:val="58A2146A"/>
+    <w:nsid w:val="6D7608C0"/>
     <w:multiLevelType w:val="singleLevel"/>
     <w:tmpl w:val="04160001"/>
     <w:lvl w:ilvl="0">
@@ -5286,7 +5303,7 @@
     </w:lvl>
   </w:abstractNum>
   <w:abstractNum w:abstractNumId="17" w15:restartNumberingAfterBreak="0">
-    <w:nsid w:val="67A32CAD"/>
+    <w:nsid w:val="6F3174F6"/>
     <w:multiLevelType w:val="singleLevel"/>
     <w:tmpl w:val="04160001"/>
     <w:lvl w:ilvl="0">
@@ -5303,7 +5320,7 @@
     </w:lvl>
   </w:abstractNum>
   <w:abstractNum w:abstractNumId="18" w15:restartNumberingAfterBreak="0">
-    <w:nsid w:val="71EE00F5"/>
+    <w:nsid w:val="6F805392"/>
     <w:multiLevelType w:val="singleLevel"/>
     <w:tmpl w:val="04160001"/>
     <w:lvl w:ilvl="0">
@@ -5320,7 +5337,7 @@
     </w:lvl>
   </w:abstractNum>
   <w:abstractNum w:abstractNumId="19" w15:restartNumberingAfterBreak="0">
-    <w:nsid w:val="73C50B94"/>
+    <w:nsid w:val="70EA050E"/>
     <w:multiLevelType w:val="singleLevel"/>
     <w:tmpl w:val="04160001"/>
     <w:lvl w:ilvl="0">
@@ -5337,7 +5354,7 @@
     </w:lvl>
   </w:abstractNum>
   <w:abstractNum w:abstractNumId="20" w15:restartNumberingAfterBreak="0">
-    <w:nsid w:val="75C90332"/>
+    <w:nsid w:val="74A5399D"/>
     <w:multiLevelType w:val="singleLevel"/>
     <w:tmpl w:val="04160001"/>
     <w:lvl w:ilvl="0">
@@ -5354,7 +5371,7 @@
     </w:lvl>
   </w:abstractNum>
   <w:abstractNum w:abstractNumId="21" w15:restartNumberingAfterBreak="0">
-    <w:nsid w:val="7EE7317F"/>
+    <w:nsid w:val="7C191A64"/>
     <w:multiLevelType w:val="singleLevel"/>
     <w:tmpl w:val="04160001"/>
     <w:lvl w:ilvl="0">
@@ -5370,71 +5387,71 @@
       </w:rPr>
     </w:lvl>
   </w:abstractNum>
-  <w:num w:numId="1" w16cid:durableId="259989872">
+  <w:num w:numId="1" w16cid:durableId="1003899703">
+    <w:abstractNumId w:val="8"/>
+  </w:num>
+  <w:num w:numId="2" w16cid:durableId="1361131262">
+    <w:abstractNumId w:val="17"/>
+  </w:num>
+  <w:num w:numId="3" w16cid:durableId="1038354738">
+    <w:abstractNumId w:val="16"/>
+  </w:num>
+  <w:num w:numId="4" w16cid:durableId="157769352">
+    <w:abstractNumId w:val="15"/>
+  </w:num>
+  <w:num w:numId="5" w16cid:durableId="1513687571">
+    <w:abstractNumId w:val="6"/>
+  </w:num>
+  <w:num w:numId="6" w16cid:durableId="393895738">
+    <w:abstractNumId w:val="18"/>
+  </w:num>
+  <w:num w:numId="7" w16cid:durableId="2081438587">
+    <w:abstractNumId w:val="3"/>
+  </w:num>
+  <w:num w:numId="8" w16cid:durableId="2000109679">
+    <w:abstractNumId w:val="2"/>
+  </w:num>
+  <w:num w:numId="9" w16cid:durableId="1943031635">
+    <w:abstractNumId w:val="13"/>
+  </w:num>
+  <w:num w:numId="10" w16cid:durableId="1027099034">
+    <w:abstractNumId w:val="9"/>
+  </w:num>
+  <w:num w:numId="11" w16cid:durableId="841354856">
+    <w:abstractNumId w:val="19"/>
+  </w:num>
+  <w:num w:numId="12" w16cid:durableId="219830449">
+    <w:abstractNumId w:val="12"/>
+  </w:num>
+  <w:num w:numId="13" w16cid:durableId="576987566">
+    <w:abstractNumId w:val="7"/>
+  </w:num>
+  <w:num w:numId="14" w16cid:durableId="1185052307">
+    <w:abstractNumId w:val="5"/>
+  </w:num>
+  <w:num w:numId="15" w16cid:durableId="354307116">
+    <w:abstractNumId w:val="0"/>
+  </w:num>
+  <w:num w:numId="16" w16cid:durableId="53045267">
+    <w:abstractNumId w:val="21"/>
+  </w:num>
+  <w:num w:numId="17" w16cid:durableId="1694725490">
+    <w:abstractNumId w:val="14"/>
+  </w:num>
+  <w:num w:numId="18" w16cid:durableId="2044016268">
+    <w:abstractNumId w:val="11"/>
+  </w:num>
+  <w:num w:numId="19" w16cid:durableId="810563271">
+    <w:abstractNumId w:val="4"/>
+  </w:num>
+  <w:num w:numId="20" w16cid:durableId="361056938">
     <w:abstractNumId w:val="1"/>
   </w:num>
-  <w:num w:numId="2" w16cid:durableId="658462443">
-    <w:abstractNumId w:val="10"/>
-  </w:num>
-  <w:num w:numId="3" w16cid:durableId="2109346527">
-    <w:abstractNumId w:val="8"/>
-  </w:num>
-  <w:num w:numId="4" w16cid:durableId="1024480563">
-    <w:abstractNumId w:val="9"/>
-  </w:num>
-  <w:num w:numId="5" w16cid:durableId="250050793">
-    <w:abstractNumId w:val="13"/>
-  </w:num>
-  <w:num w:numId="6" w16cid:durableId="708190270">
-    <w:abstractNumId w:val="3"/>
-  </w:num>
-  <w:num w:numId="7" w16cid:durableId="739014376">
+  <w:num w:numId="21" w16cid:durableId="737019680">
     <w:abstractNumId w:val="20"/>
   </w:num>
-  <w:num w:numId="8" w16cid:durableId="906376974">
-    <w:abstractNumId w:val="16"/>
-  </w:num>
-  <w:num w:numId="9" w16cid:durableId="4407674">
-    <w:abstractNumId w:val="4"/>
-  </w:num>
-  <w:num w:numId="10" w16cid:durableId="1613708272">
-    <w:abstractNumId w:val="6"/>
-  </w:num>
-  <w:num w:numId="11" w16cid:durableId="2045053280">
-    <w:abstractNumId w:val="14"/>
-  </w:num>
-  <w:num w:numId="12" w16cid:durableId="2132480990">
-    <w:abstractNumId w:val="18"/>
-  </w:num>
-  <w:num w:numId="13" w16cid:durableId="1837071475">
-    <w:abstractNumId w:val="7"/>
-  </w:num>
-  <w:num w:numId="14" w16cid:durableId="114718041">
-    <w:abstractNumId w:val="5"/>
-  </w:num>
-  <w:num w:numId="15" w16cid:durableId="910039881">
-    <w:abstractNumId w:val="19"/>
-  </w:num>
-  <w:num w:numId="16" w16cid:durableId="1591113010">
-    <w:abstractNumId w:val="12"/>
-  </w:num>
-  <w:num w:numId="17" w16cid:durableId="2093239073">
-    <w:abstractNumId w:val="17"/>
-  </w:num>
-  <w:num w:numId="18" w16cid:durableId="1750688190">
-    <w:abstractNumId w:val="21"/>
-  </w:num>
-  <w:num w:numId="19" w16cid:durableId="309211387">
-    <w:abstractNumId w:val="15"/>
-  </w:num>
-  <w:num w:numId="20" w16cid:durableId="1950962561">
-    <w:abstractNumId w:val="11"/>
-  </w:num>
-  <w:num w:numId="21" w16cid:durableId="1323194223">
-    <w:abstractNumId w:val="2"/>
-  </w:num>
-  <w:num w:numId="22" w16cid:durableId="1089548077">
-    <w:abstractNumId w:val="0"/>
+  <w:num w:numId="22" w16cid:durableId="90930539">
+    <w:abstractNumId w:val="10"/>
   </w:num>
 </w:numbering>
 </file>
@@ -5847,7 +5864,7 @@
     <w:link w:val="Ttulo1Char"/>
     <w:uiPriority w:val="9"/>
     <w:qFormat/>
-    <w:rsid w:val="00784486"/>
+    <w:rsid w:val="007C1277"/>
     <w:pPr>
       <w:keepNext/>
       <w:keepLines/>
@@ -5870,7 +5887,7 @@
     <w:semiHidden/>
     <w:unhideWhenUsed/>
     <w:qFormat/>
-    <w:rsid w:val="00784486"/>
+    <w:rsid w:val="007C1277"/>
     <w:pPr>
       <w:keepNext/>
       <w:keepLines/>
@@ -5893,7 +5910,7 @@
     <w:semiHidden/>
     <w:unhideWhenUsed/>
     <w:qFormat/>
-    <w:rsid w:val="00784486"/>
+    <w:rsid w:val="007C1277"/>
     <w:pPr>
       <w:keepNext/>
       <w:keepLines/>
@@ -5916,7 +5933,7 @@
     <w:semiHidden/>
     <w:unhideWhenUsed/>
     <w:qFormat/>
-    <w:rsid w:val="00784486"/>
+    <w:rsid w:val="007C1277"/>
     <w:pPr>
       <w:keepNext/>
       <w:keepLines/>
@@ -5939,7 +5956,7 @@
     <w:semiHidden/>
     <w:unhideWhenUsed/>
     <w:qFormat/>
-    <w:rsid w:val="00784486"/>
+    <w:rsid w:val="007C1277"/>
     <w:pPr>
       <w:keepNext/>
       <w:keepLines/>
@@ -5960,7 +5977,7 @@
     <w:semiHidden/>
     <w:unhideWhenUsed/>
     <w:qFormat/>
-    <w:rsid w:val="00784486"/>
+    <w:rsid w:val="007C1277"/>
     <w:pPr>
       <w:keepNext/>
       <w:keepLines/>
@@ -5983,7 +6000,7 @@
     <w:semiHidden/>
     <w:unhideWhenUsed/>
     <w:qFormat/>
-    <w:rsid w:val="00784486"/>
+    <w:rsid w:val="007C1277"/>
     <w:pPr>
       <w:keepNext/>
       <w:keepLines/>
@@ -6004,7 +6021,7 @@
     <w:semiHidden/>
     <w:unhideWhenUsed/>
     <w:qFormat/>
-    <w:rsid w:val="00784486"/>
+    <w:rsid w:val="007C1277"/>
     <w:pPr>
       <w:keepNext/>
       <w:keepLines/>
@@ -6027,7 +6044,7 @@
     <w:semiHidden/>
     <w:unhideWhenUsed/>
     <w:qFormat/>
-    <w:rsid w:val="00784486"/>
+    <w:rsid w:val="007C1277"/>
     <w:pPr>
       <w:keepNext/>
       <w:keepLines/>
@@ -6071,7 +6088,7 @@
     <w:basedOn w:val="Fontepargpadro"/>
     <w:link w:val="Ttulo1"/>
     <w:uiPriority w:val="9"/>
-    <w:rsid w:val="00784486"/>
+    <w:rsid w:val="007C1277"/>
     <w:rPr>
       <w:rFonts w:asciiTheme="majorHAnsi" w:eastAsiaTheme="majorEastAsia" w:hAnsiTheme="majorHAnsi" w:cstheme="majorBidi"/>
       <w:color w:val="0F4761" w:themeColor="accent1" w:themeShade="BF"/>
@@ -6085,7 +6102,7 @@
     <w:link w:val="Ttulo2"/>
     <w:uiPriority w:val="9"/>
     <w:semiHidden/>
-    <w:rsid w:val="00784486"/>
+    <w:rsid w:val="007C1277"/>
     <w:rPr>
       <w:rFonts w:asciiTheme="majorHAnsi" w:eastAsiaTheme="majorEastAsia" w:hAnsiTheme="majorHAnsi" w:cstheme="majorBidi"/>
       <w:color w:val="0F4761" w:themeColor="accent1" w:themeShade="BF"/>
@@ -6099,7 +6116,7 @@
     <w:link w:val="Ttulo3"/>
     <w:uiPriority w:val="9"/>
     <w:semiHidden/>
-    <w:rsid w:val="00784486"/>
+    <w:rsid w:val="007C1277"/>
     <w:rPr>
       <w:rFonts w:eastAsiaTheme="majorEastAsia" w:cstheme="majorBidi"/>
       <w:color w:val="0F4761" w:themeColor="accent1" w:themeShade="BF"/>
@@ -6113,7 +6130,7 @@
     <w:link w:val="Ttulo4"/>
     <w:uiPriority w:val="9"/>
     <w:semiHidden/>
-    <w:rsid w:val="00784486"/>
+    <w:rsid w:val="007C1277"/>
     <w:rPr>
       <w:rFonts w:eastAsiaTheme="majorEastAsia" w:cstheme="majorBidi"/>
       <w:i/>
@@ -6127,7 +6144,7 @@
     <w:link w:val="Ttulo5"/>
     <w:uiPriority w:val="9"/>
     <w:semiHidden/>
-    <w:rsid w:val="00784486"/>
+    <w:rsid w:val="007C1277"/>
     <w:rPr>
       <w:rFonts w:eastAsiaTheme="majorEastAsia" w:cstheme="majorBidi"/>
       <w:color w:val="0F4761" w:themeColor="accent1" w:themeShade="BF"/>
@@ -6139,7 +6156,7 @@
     <w:link w:val="Ttulo6"/>
     <w:uiPriority w:val="9"/>
     <w:semiHidden/>
-    <w:rsid w:val="00784486"/>
+    <w:rsid w:val="007C1277"/>
     <w:rPr>
       <w:rFonts w:eastAsiaTheme="majorEastAsia" w:cstheme="majorBidi"/>
       <w:i/>
@@ -6153,7 +6170,7 @@
     <w:link w:val="Ttulo7"/>
     <w:uiPriority w:val="9"/>
     <w:semiHidden/>
-    <w:rsid w:val="00784486"/>
+    <w:rsid w:val="007C1277"/>
     <w:rPr>
       <w:rFonts w:eastAsiaTheme="majorEastAsia" w:cstheme="majorBidi"/>
       <w:color w:val="595959" w:themeColor="text1" w:themeTint="A6"/>
@@ -6165,7 +6182,7 @@
     <w:link w:val="Ttulo8"/>
     <w:uiPriority w:val="9"/>
     <w:semiHidden/>
-    <w:rsid w:val="00784486"/>
+    <w:rsid w:val="007C1277"/>
     <w:rPr>
       <w:rFonts w:eastAsiaTheme="majorEastAsia" w:cstheme="majorBidi"/>
       <w:i/>
@@ -6179,7 +6196,7 @@
     <w:link w:val="Ttulo9"/>
     <w:uiPriority w:val="9"/>
     <w:semiHidden/>
-    <w:rsid w:val="00784486"/>
+    <w:rsid w:val="007C1277"/>
     <w:rPr>
       <w:rFonts w:eastAsiaTheme="majorEastAsia" w:cstheme="majorBidi"/>
       <w:color w:val="272727" w:themeColor="text1" w:themeTint="D8"/>
@@ -6192,7 +6209,7 @@
     <w:link w:val="TtuloChar"/>
     <w:uiPriority w:val="10"/>
     <w:qFormat/>
-    <w:rsid w:val="00784486"/>
+    <w:rsid w:val="007C1277"/>
     <w:pPr>
       <w:spacing w:after="80" w:line="240" w:lineRule="auto"/>
       <w:contextualSpacing/>
@@ -6210,7 +6227,7 @@
     <w:basedOn w:val="Fontepargpadro"/>
     <w:link w:val="Ttulo"/>
     <w:uiPriority w:val="10"/>
-    <w:rsid w:val="00784486"/>
+    <w:rsid w:val="007C1277"/>
     <w:rPr>
       <w:rFonts w:asciiTheme="majorHAnsi" w:eastAsiaTheme="majorEastAsia" w:hAnsiTheme="majorHAnsi" w:cstheme="majorBidi"/>
       <w:spacing w:val="-10"/>
@@ -6226,7 +6243,7 @@
     <w:link w:val="SubttuloChar"/>
     <w:uiPriority w:val="11"/>
     <w:qFormat/>
-    <w:rsid w:val="00784486"/>
+    <w:rsid w:val="007C1277"/>
     <w:pPr>
       <w:numPr>
         <w:ilvl w:val="1"/>
@@ -6245,7 +6262,7 @@
     <w:basedOn w:val="Fontepargpadro"/>
     <w:link w:val="Subttulo"/>
     <w:uiPriority w:val="11"/>
-    <w:rsid w:val="00784486"/>
+    <w:rsid w:val="007C1277"/>
     <w:rPr>
       <w:rFonts w:eastAsiaTheme="majorEastAsia" w:cstheme="majorBidi"/>
       <w:color w:val="595959" w:themeColor="text1" w:themeTint="A6"/>
@@ -6261,7 +6278,7 @@
     <w:link w:val="CitaoChar"/>
     <w:uiPriority w:val="29"/>
     <w:qFormat/>
-    <w:rsid w:val="00784486"/>
+    <w:rsid w:val="007C1277"/>
     <w:pPr>
       <w:spacing w:before="160"/>
       <w:jc w:val="center"/>
@@ -6277,7 +6294,7 @@
     <w:basedOn w:val="Fontepargpadro"/>
     <w:link w:val="Citao"/>
     <w:uiPriority w:val="29"/>
-    <w:rsid w:val="00784486"/>
+    <w:rsid w:val="007C1277"/>
     <w:rPr>
       <w:i/>
       <w:iCs/>
@@ -6289,7 +6306,7 @@
     <w:basedOn w:val="Normal"/>
     <w:uiPriority w:val="34"/>
     <w:qFormat/>
-    <w:rsid w:val="00784486"/>
+    <w:rsid w:val="007C1277"/>
     <w:pPr>
       <w:ind w:left="720"/>
       <w:contextualSpacing/>
@@ -6300,7 +6317,7 @@
     <w:basedOn w:val="Fontepargpadro"/>
     <w:uiPriority w:val="21"/>
     <w:qFormat/>
-    <w:rsid w:val="00784486"/>
+    <w:rsid w:val="007C1277"/>
     <w:rPr>
       <w:i/>
       <w:iCs/>
@@ -6314,7 +6331,7 @@
     <w:link w:val="CitaoIntensaChar"/>
     <w:uiPriority w:val="30"/>
     <w:qFormat/>
-    <w:rsid w:val="00784486"/>
+    <w:rsid w:val="007C1277"/>
     <w:pPr>
       <w:pBdr>
         <w:top w:val="single" w:sz="4" w:space="10" w:color="0F4761" w:themeColor="accent1" w:themeShade="BF"/>
@@ -6335,7 +6352,7 @@
     <w:basedOn w:val="Fontepargpadro"/>
     <w:link w:val="CitaoIntensa"/>
     <w:uiPriority w:val="30"/>
-    <w:rsid w:val="00784486"/>
+    <w:rsid w:val="007C1277"/>
     <w:rPr>
       <w:i/>
       <w:iCs/>
@@ -6347,7 +6364,7 @@
     <w:basedOn w:val="Fontepargpadro"/>
     <w:uiPriority w:val="32"/>
     <w:qFormat/>
-    <w:rsid w:val="00784486"/>
+    <w:rsid w:val="007C1277"/>
     <w:rPr>
       <w:b/>
       <w:bCs/>

</xml_diff>